<commit_message>
Rebuild capabilities one-pager with real Beacon brand and v2 copy
- Align to actual beaconmfg.us palette: yellow #fdb602, cream #fdf6e4,
  deep teal #022429, sand #c9b789
- Typography: Barlow Condensed (display) + Figtree (body) via Google Fonts
- Replace yellow "B" square with the real Beacon mark — yellow disc with
  triangular slice (lighthouse-beam motif) as inline SVG in HTML and
  embedded PNG in DOCX
- Update copy per v2 source: "Builder-led contract manufacturing in
  Detroit", "Bring us a problem", "Send a print. We'll put it on a line."
- Real address: 2050 15th St, Detroit, MI 48216; URL chip beaconmfg.us
- Drop fabricated phone/email and Equipment Highlights section
  (per EJ: "leave equipment out for brevity, focus on deliverables")
- Add ethos line: "Local Mfg. · 100% Onshore American Industry"
- Save brand assets to assets/ (mark + wordmark) for DOCX/reuse

Co-Authored-By: Claude Opus 4.7 (1M context) <noreply@anthropic.com>
</commit_message>
<xml_diff>
--- a/Beacon-Capabilities-Statement.docx
+++ b/Beacon-Capabilities-Statement.docx
@@ -1,26 +1,34 @@
 
 <file path=word/document.xml><?xml version="1.0" encoding="utf-8"?>
 <w:document xmlns:wpc="http://schemas.microsoft.com/office/word/2010/wordprocessingCanvas" xmlns:mo="http://schemas.microsoft.com/office/mac/office/2008/main" xmlns:mc="http://schemas.openxmlformats.org/markup-compatibility/2006" xmlns:mv="urn:schemas-microsoft-com:mac:vml" xmlns:o="urn:schemas-microsoft-com:office:office" xmlns:r="http://schemas.openxmlformats.org/officeDocument/2006/relationships" xmlns:m="http://schemas.openxmlformats.org/officeDocument/2006/math" xmlns:v="urn:schemas-microsoft-com:vml" xmlns:wp14="http://schemas.microsoft.com/office/word/2010/wordprocessingDrawing" xmlns:wp="http://schemas.openxmlformats.org/drawingml/2006/wordprocessingDrawing" xmlns:w10="urn:schemas-microsoft-com:office:word" xmlns:w="http://schemas.openxmlformats.org/wordprocessingml/2006/main" xmlns:w14="http://schemas.microsoft.com/office/word/2010/wordml" xmlns:wpg="http://schemas.microsoft.com/office/word/2010/wordprocessingGroup" xmlns:wpi="http://schemas.microsoft.com/office/word/2010/wordprocessingInk" xmlns:wne="http://schemas.microsoft.com/office/word/2006/wordml" xmlns:wps="http://schemas.microsoft.com/office/word/2010/wordprocessingShape" mc:Ignorable="w14 wp14">
-  <w:background w:color="FCF6E6"/>
+  <w:background w:color="FDF6E4"/>
   <w:body>
     <w:tbl>
       <w:tblPr>
         <w:tblW w:type="auto" w:w="0"/>
         <w:tblLayout w:type="fixed"/>
         <w:tblLook w:firstColumn="1" w:firstRow="1" w:lastColumn="0" w:lastRow="0" w:noHBand="0" w:noVBand="1" w:val="04A0"/>
+        <w:tblBorders>
+          <w:top w:val="nil"/>
+          <w:left w:val="nil"/>
+          <w:bottom w:val="nil"/>
+          <w:right w:val="nil"/>
+          <w:insideH w:val="nil"/>
+          <w:insideV w:val="nil"/>
+        </w:tblBorders>
       </w:tblPr>
       <w:tblGrid>
-        <w:gridCol w:w="6624"/>
+        <w:gridCol w:w="6768"/>
         <w:gridCol w:w="4032"/>
       </w:tblGrid>
       <w:tr>
         <w:tc>
           <w:tcPr>
-            <w:tcW w:type="dxa" w:w="6624"/>
+            <w:tcW w:type="dxa" w:w="6768"/>
             <w:tcBorders>
               <w:top w:val="nil" w:sz="4" w:space="0" w:color="000000"/>
               <w:left w:val="nil" w:sz="4" w:space="0" w:color="000000"/>
-              <w:bottom w:val="single" w:sz="16" w:space="0" w:color="1B2738"/>
+              <w:bottom w:val="single" w:sz="24" w:space="0" w:color="022429"/>
               <w:right w:val="nil" w:sz="4" w:space="0" w:color="000000"/>
             </w:tcBorders>
           </w:tcPr>
@@ -34,50 +42,70 @@
               <w:tblW w:type="auto" w:w="0"/>
               <w:tblLayout w:type="fixed"/>
               <w:tblLook w:firstColumn="1" w:firstRow="1" w:lastColumn="0" w:lastRow="0" w:noHBand="0" w:noVBand="1" w:val="04A0"/>
+              <w:tblBorders>
+                <w:top w:val="nil"/>
+                <w:left w:val="nil"/>
+                <w:bottom w:val="nil"/>
+                <w:right w:val="nil"/>
+                <w:insideH w:val="nil"/>
+                <w:insideV w:val="nil"/>
+              </w:tblBorders>
             </w:tblPr>
             <w:tblGrid>
-              <w:gridCol w:w="1080"/>
-              <w:gridCol w:w="5328"/>
+              <w:gridCol w:w="1123"/>
+              <w:gridCol w:w="5544"/>
             </w:tblGrid>
             <w:tr>
               <w:tc>
                 <w:tcPr>
-                  <w:tcW w:type="dxa" w:w="1080"/>
-                  <w:shd w:val="clear" w:color="auto" w:fill="F5B82E"/>
+                  <w:tcW w:type="dxa" w:w="1123"/>
                   <w:vAlign w:val="center"/>
-                  <w:tcBorders>
-                    <w:top w:val="nil" w:sz="4" w:space="0" w:color="000000"/>
-                    <w:left w:val="nil" w:sz="4" w:space="0" w:color="000000"/>
-                    <w:bottom w:val="nil" w:sz="4" w:space="0" w:color="000000"/>
-                    <w:right w:val="nil" w:sz="4" w:space="0" w:color="000000"/>
-                  </w:tcBorders>
                 </w:tcPr>
                 <w:p>
                   <w:pPr>
-                    <w:spacing w:before="40" w:after="0" w:line="276" w:lineRule="auto"/>
-                    <w:jc w:val="center"/>
+                    <w:spacing w:before="0" w:after="0" w:line="276" w:lineRule="auto"/>
+                    <w:jc w:val="left"/>
                   </w:pPr>
                   <w:r>
-                    <w:rPr>
-                      <w:rFonts w:ascii="Helvetica" w:hAnsi="Helvetica"/>
-                      <w:b/>
-                      <w:color w:val="1B2738"/>
-                      <w:sz w:val="68"/>
-                    </w:rPr>
-                    <w:t>B</w:t>
+                    <w:drawing>
+                      <wp:inline xmlns:a="http://schemas.openxmlformats.org/drawingml/2006/main" xmlns:pic="http://schemas.openxmlformats.org/drawingml/2006/picture">
+                        <wp:extent cx="594360" cy="594360"/>
+                        <wp:docPr id="1" name="Picture 1"/>
+                        <wp:cNvGraphicFramePr>
+                          <a:graphicFrameLocks noChangeAspect="1"/>
+                        </wp:cNvGraphicFramePr>
+                        <a:graphic>
+                          <a:graphicData uri="http://schemas.openxmlformats.org/drawingml/2006/picture">
+                            <pic:pic>
+                              <pic:nvPicPr>
+                                <pic:cNvPr id="0" name="beacon-mark.png"/>
+                                <pic:cNvPicPr/>
+                              </pic:nvPicPr>
+                              <pic:blipFill>
+                                <a:blip r:embed="rId9"/>
+                                <a:stretch>
+                                  <a:fillRect/>
+                                </a:stretch>
+                              </pic:blipFill>
+                              <pic:spPr>
+                                <a:xfrm>
+                                  <a:off x="0" y="0"/>
+                                  <a:ext cx="594360" cy="594360"/>
+                                </a:xfrm>
+                                <a:prstGeom prst="rect"/>
+                              </pic:spPr>
+                            </pic:pic>
+                          </a:graphicData>
+                        </a:graphic>
+                      </wp:inline>
+                    </w:drawing>
                   </w:r>
                 </w:p>
               </w:tc>
               <w:tc>
                 <w:tcPr>
-                  <w:tcW w:type="dxa" w:w="3312"/>
+                  <w:tcW w:type="dxa" w:w="3384"/>
                   <w:vAlign w:val="center"/>
-                  <w:tcBorders>
-                    <w:top w:val="nil" w:sz="4" w:space="0" w:color="000000"/>
-                    <w:left w:val="nil" w:sz="4" w:space="0" w:color="000000"/>
-                    <w:bottom w:val="nil" w:sz="4" w:space="0" w:color="000000"/>
-                    <w:right w:val="nil" w:sz="4" w:space="0" w:color="000000"/>
-                  </w:tcBorders>
                 </w:tcPr>
                 <w:p>
                   <w:pPr>
@@ -85,27 +113,39 @@
                   </w:pPr>
                   <w:r>
                     <w:rPr>
-                      <w:rFonts w:ascii="Helvetica" w:hAnsi="Helvetica"/>
+                      <w:rFonts w:ascii="Figtree" w:hAnsi="Figtree" w:cs="Figtree"/>
                       <w:b/>
-                      <w:color w:val="1B2738"/>
+                      <w:i w:val="0"/>
+                      <w:color w:val="022429"/>
                       <w:sz w:val="16"/>
-                      <w:spacing w:val="40"/>
+                      <w:spacing w:val="50"/>
                     </w:rPr>
-                    <w:t>CAPABILITIES STATEMENT</w:t>
+                    <w:t>CAPABILITIES STATEMENT · V2</w:t>
                   </w:r>
                 </w:p>
                 <w:p>
                   <w:pPr>
-                    <w:spacing w:before="0" w:after="0" w:line="276" w:lineRule="auto"/>
+                    <w:spacing w:before="20" w:after="0" w:line="276" w:lineRule="auto"/>
                   </w:pPr>
                   <w:r>
                     <w:rPr>
-                      <w:rFonts w:ascii="Helvetica" w:hAnsi="Helvetica"/>
+                      <w:rFonts w:ascii="Barlow Condensed" w:hAnsi="Barlow Condensed" w:cs="Barlow Condensed"/>
                       <w:b/>
-                      <w:color w:val="1B2738"/>
-                      <w:sz w:val="40"/>
+                      <w:i w:val="0"/>
+                      <w:color w:val="022429"/>
+                      <w:sz w:val="52"/>
                     </w:rPr>
-                    <w:t>Beacon Manufacturing</w:t>
+                    <w:t xml:space="preserve">BEACON </w:t>
+                  </w:r>
+                  <w:r>
+                    <w:rPr>
+                      <w:rFonts w:ascii="Barlow Condensed" w:hAnsi="Barlow Condensed" w:cs="Barlow Condensed"/>
+                      <w:b w:val="0"/>
+                      <w:i w:val="0"/>
+                      <w:color w:val="022429"/>
+                      <w:sz w:val="52"/>
+                    </w:rPr>
+                    <w:t>MANUFACTURING</w:t>
                   </w:r>
                 </w:p>
               </w:tc>
@@ -116,11 +156,10 @@
         <w:tc>
           <w:tcPr>
             <w:tcW w:type="dxa" w:w="4032"/>
-            <w:vAlign w:val="top"/>
             <w:tcBorders>
               <w:top w:val="nil" w:sz="4" w:space="0" w:color="000000"/>
               <w:left w:val="nil" w:sz="4" w:space="0" w:color="000000"/>
-              <w:bottom w:val="single" w:sz="16" w:space="0" w:color="1B2738"/>
+              <w:bottom w:val="single" w:sz="24" w:space="0" w:color="022429"/>
               <w:right w:val="nil" w:sz="4" w:space="0" w:color="000000"/>
             </w:tcBorders>
           </w:tcPr>
@@ -131,13 +170,14 @@
             </w:pPr>
             <w:r>
               <w:rPr>
-                <w:rFonts w:ascii="Helvetica" w:hAnsi="Helvetica"/>
+                <w:rFonts w:ascii="Barlow Condensed" w:hAnsi="Barlow Condensed" w:cs="Barlow Condensed"/>
                 <w:b/>
-                <w:color w:val="1B2738"/>
-                <w:sz w:val="18"/>
-                <w:spacing w:val="30"/>
+                <w:i w:val="0"/>
+                <w:color w:val="022429"/>
+                <w:sz w:val="22"/>
+                <w:spacing w:val="40"/>
               </w:rPr>
-              <w:t>DETROIT, MICHIGAN</w:t>
+              <w:t>DETROIT · MICHIGAN</w:t>
             </w:r>
           </w:p>
           <w:p>
@@ -147,12 +187,13 @@
             </w:pPr>
             <w:r>
               <w:rPr>
-                <w:rFonts w:ascii="Helvetica" w:hAnsi="Helvetica"/>
+                <w:rFonts w:ascii="Figtree" w:hAnsi="Figtree" w:cs="Figtree"/>
                 <w:b w:val="0"/>
-                <w:color w:val="1B2738"/>
+                <w:i w:val="0"/>
+                <w:color w:val="022429"/>
                 <w:sz w:val="18"/>
               </w:rPr>
-              <w:t>2200 Beaufait Avenue</w:t>
+              <w:t>2050 15th St</w:t>
             </w:r>
           </w:p>
           <w:p>
@@ -162,12 +203,13 @@
             </w:pPr>
             <w:r>
               <w:rPr>
-                <w:rFonts w:ascii="Helvetica" w:hAnsi="Helvetica"/>
+                <w:rFonts w:ascii="Figtree" w:hAnsi="Figtree" w:cs="Figtree"/>
                 <w:b w:val="0"/>
-                <w:color w:val="1B2738"/>
+                <w:i w:val="0"/>
+                <w:color w:val="022429"/>
                 <w:sz w:val="18"/>
               </w:rPr>
-              <w:t>Detroit, MI 48207</w:t>
+              <w:t>Detroit, MI 48216</w:t>
             </w:r>
           </w:p>
           <w:p>
@@ -177,27 +219,30 @@
             </w:pPr>
             <w:r>
               <w:rPr>
-                <w:rFonts w:ascii="Helvetica" w:hAnsi="Helvetica"/>
+                <w:rFonts w:ascii="Figtree" w:hAnsi="Figtree" w:cs="Figtree"/>
                 <w:b w:val="0"/>
-                <w:color w:val="1B2738"/>
+                <w:i w:val="0"/>
+                <w:color w:val="022429"/>
                 <w:sz w:val="18"/>
               </w:rPr>
-              <w:t>hello@beaconmfg.com · (313) 555-0184</w:t>
+              <w:t>Local Mfg. · 100% Onshore</w:t>
             </w:r>
           </w:p>
           <w:p>
             <w:pPr>
-              <w:spacing w:before="0" w:after="0" w:line="276" w:lineRule="auto"/>
+              <w:spacing w:before="60" w:after="0" w:line="276" w:lineRule="auto"/>
               <w:jc w:val="right"/>
             </w:pPr>
             <w:r>
               <w:rPr>
-                <w:rFonts w:ascii="Helvetica" w:hAnsi="Helvetica"/>
-                <w:b w:val="0"/>
-                <w:color w:val="1B2738"/>
-                <w:sz w:val="18"/>
+                <w:rFonts w:ascii="Figtree" w:hAnsi="Figtree" w:cs="Figtree"/>
+                <w:b/>
+                <w:i w:val="0"/>
+                <w:color w:val="022429"/>
+                <w:sz w:val="20"/>
+                <w:shd w:val="clear" w:color="auto" w:fill="FDB602"/>
               </w:rPr>
-              <w:t>beaconmfg.com</w:t>
+              <w:t xml:space="preserve">  beaconmfg.us  </w:t>
             </w:r>
           </w:p>
         </w:tc>
@@ -205,68 +250,93 @@
     </w:tbl>
     <w:p>
       <w:pPr>
-        <w:spacing w:before="0" w:after="160" w:line="276" w:lineRule="auto"/>
+        <w:spacing w:before="0" w:after="120" w:line="276" w:lineRule="auto"/>
       </w:pPr>
     </w:p>
     <w:p>
       <w:pPr>
-        <w:spacing w:before="0" w:after="0" w:line="276" w:lineRule="auto"/>
+        <w:spacing w:before="0" w:after="40" w:line="276" w:lineRule="auto"/>
       </w:pPr>
       <w:r>
         <w:rPr>
-          <w:rFonts w:ascii="Helvetica" w:hAnsi="Helvetica"/>
+          <w:rFonts w:ascii="Barlow Condensed" w:hAnsi="Barlow Condensed" w:cs="Barlow Condensed"/>
           <w:b/>
-          <w:color w:val="1B2738"/>
-          <w:sz w:val="36"/>
+          <w:i w:val="0"/>
+          <w:color w:val="022429"/>
+          <w:sz w:val="52"/>
         </w:rPr>
-        <w:t xml:space="preserve">Metal fabrication, assembly, and prototyping </w:t>
+        <w:t xml:space="preserve">BUILDER-LED </w:t>
       </w:r>
       <w:r>
         <w:rPr>
-          <w:rFonts w:ascii="Helvetica" w:hAnsi="Helvetica"/>
+          <w:rFonts w:ascii="Barlow Condensed" w:hAnsi="Barlow Condensed" w:cs="Barlow Condensed"/>
           <w:b/>
-          <w:color w:val="F5B82E"/>
-          <w:sz w:val="36"/>
+          <w:i w:val="0"/>
+          <w:color w:val="022429"/>
+          <w:sz w:val="52"/>
+          <w:shd w:val="clear" w:color="auto" w:fill="FDB602"/>
         </w:rPr>
-        <w:t>—</w:t>
-      </w:r>
-      <w:r>
-        <w:rPr>
-          <w:rFonts w:ascii="Helvetica" w:hAnsi="Helvetica"/>
-          <w:b/>
-          <w:color w:val="1B2738"/>
-          <w:sz w:val="36"/>
-        </w:rPr>
-        <w:t xml:space="preserve"> made in Detroit.</w:t>
+        <w:t xml:space="preserve">  CONTRACT MANUFACTURING  </w:t>
       </w:r>
     </w:p>
     <w:p>
       <w:pPr>
-        <w:spacing w:before="80" w:after="120" w:line="276" w:lineRule="auto"/>
+        <w:spacing w:before="0" w:after="80" w:line="276" w:lineRule="auto"/>
       </w:pPr>
       <w:r>
         <w:rPr>
-          <w:rFonts w:ascii="Helvetica" w:hAnsi="Helvetica"/>
-          <w:b w:val="0"/>
-          <w:color w:val="1B2738"/>
-          <w:sz w:val="20"/>
+          <w:rFonts w:ascii="Barlow Condensed" w:hAnsi="Barlow Condensed" w:cs="Barlow Condensed"/>
+          <w:b/>
+          <w:i w:val="0"/>
+          <w:color w:val="022429"/>
+          <w:sz w:val="52"/>
         </w:rPr>
-        <w:t>Beacon Manufacturing is a Detroit-based contract manufacturer pairing decades of skilled-trade craftsmanship with modern digital fabrication. From one-off prototypes to recurring production runs, we cut, form, weld, finish, assemble, kit, and ship — all under one roof. Short lead times, tight tolerances, and a single point of accountability for engineers, founders, and procurement teams.</w:t>
+        <w:t>MADE IN DETROIT.</w:t>
       </w:r>
     </w:p>
     <w:p>
       <w:pPr>
-        <w:spacing w:before="120" w:after="80" w:line="276" w:lineRule="auto"/>
+        <w:spacing w:before="40" w:after="80" w:line="336" w:lineRule="auto"/>
       </w:pPr>
       <w:r>
         <w:rPr>
-          <w:rFonts w:ascii="Helvetica" w:hAnsi="Helvetica"/>
+          <w:rFonts w:ascii="Figtree" w:hAnsi="Figtree" w:cs="Figtree"/>
           <w:b/>
-          <w:color w:val="1B2738"/>
-          <w:sz w:val="18"/>
-          <w:spacing w:val="50"/>
+          <w:i w:val="0"/>
+          <w:color w:val="022429"/>
+          <w:sz w:val="21"/>
         </w:rPr>
-        <w:t>CORE CAPABILITIES</w:t>
+        <w:t xml:space="preserve">Beacon is a builder-led contract manufacturer in Detroit </w:t>
+      </w:r>
+      <w:r>
+        <w:rPr>
+          <w:rFonts w:ascii="Figtree" w:hAnsi="Figtree" w:cs="Figtree"/>
+          <w:b w:val="0"/>
+          <w:i w:val="0"/>
+          <w:color w:val="022429"/>
+          <w:sz w:val="21"/>
+        </w:rPr>
+        <w:t xml:space="preserve">delivering metal fabrication, assembly, and rapid prototyping — from one-off prototypes to repeatable short runs and full production. </w:t>
+      </w:r>
+      <w:r>
+        <w:rPr>
+          <w:rFonts w:ascii="Figtree" w:hAnsi="Figtree" w:cs="Figtree"/>
+          <w:b/>
+          <w:i w:val="0"/>
+          <w:color w:val="022429"/>
+          <w:sz w:val="21"/>
+        </w:rPr>
+        <w:t xml:space="preserve">Bring us a problem. </w:t>
+      </w:r>
+      <w:r>
+        <w:rPr>
+          <w:rFonts w:ascii="Figtree" w:hAnsi="Figtree" w:cs="Figtree"/>
+          <w:b w:val="0"/>
+          <w:i w:val="0"/>
+          <w:color w:val="022429"/>
+          <w:sz w:val="21"/>
+        </w:rPr>
+        <w:t>We'll quote it, prototype it, and put it on a line.</w:t>
       </w:r>
     </w:p>
     <w:tbl>
@@ -274,752 +344,57 @@
         <w:tblW w:type="auto" w:w="0"/>
         <w:tblLayout w:type="fixed"/>
         <w:tblLook w:firstColumn="1" w:firstRow="1" w:lastColumn="0" w:lastRow="0" w:noHBand="0" w:noVBand="1" w:val="04A0"/>
+        <w:tblBorders>
+          <w:top w:val="nil"/>
+          <w:left w:val="nil"/>
+          <w:bottom w:val="nil"/>
+          <w:right w:val="nil"/>
+          <w:insideH w:val="nil"/>
+          <w:insideV w:val="nil"/>
+        </w:tblBorders>
       </w:tblPr>
       <w:tblGrid>
-        <w:gridCol w:w="3499"/>
-        <w:gridCol w:w="3499"/>
-        <w:gridCol w:w="3499"/>
+        <w:gridCol w:w="10800"/>
       </w:tblGrid>
       <w:tr>
         <w:tc>
           <w:tcPr>
-            <w:tcW w:type="dxa" w:w="3499"/>
-            <w:shd w:val="clear" w:color="auto" w:fill="FFFDF5"/>
-            <w:tcBorders>
-              <w:top w:val="single" w:sz="4" w:space="0" w:color="E5DDC0"/>
-              <w:left w:val="single" w:sz="36" w:space="0" w:color="F5B82E"/>
-              <w:bottom w:val="single" w:sz="4" w:space="0" w:color="E5DDC0"/>
-              <w:right w:val="single" w:sz="4" w:space="0" w:color="E5DDC0"/>
-            </w:tcBorders>
+            <w:tcW w:type="dxa" w:w="10800"/>
           </w:tcPr>
           <w:p>
             <w:pPr>
-              <w:spacing w:before="40" w:after="0" w:line="276" w:lineRule="auto"/>
+              <w:spacing w:before="120" w:after="40" w:line="276" w:lineRule="auto"/>
             </w:pPr>
             <w:r>
               <w:rPr>
-                <w:rFonts w:ascii="Helvetica" w:hAnsi="Helvetica"/>
+                <w:rFonts w:ascii="Figtree" w:hAnsi="Figtree" w:cs="Figtree"/>
                 <w:b/>
-                <w:color w:val="1B2738"/>
-                <w:sz w:val="24"/>
+                <w:i w:val="0"/>
+                <w:color w:val="FDB602"/>
+                <w:sz w:val="28"/>
               </w:rPr>
-              <w:t>Fabrication</w:t>
-            </w:r>
-          </w:p>
-          <w:p>
-            <w:pPr>
-              <w:spacing w:before="40" w:after="80" w:line="276" w:lineRule="auto"/>
-            </w:pPr>
-            <w:r>
-              <w:rPr>
-                <w:rFonts w:ascii="Helvetica" w:hAnsi="Helvetica"/>
-                <w:b w:val="0"/>
-                <w:color w:val="1B2738"/>
-                <w:sz w:val="18"/>
-              </w:rPr>
-              <w:t>Precision sheet-metal and structural metalwork from raw stock to finished part.</w:t>
-            </w:r>
-          </w:p>
-          <w:p>
-            <w:pPr>
-              <w:spacing w:before="0" w:after="0" w:line="276" w:lineRule="auto"/>
-              <w:ind w:left="115"/>
-            </w:pPr>
-            <w:r>
-              <w:rPr>
-                <w:rFonts w:ascii="Helvetica" w:hAnsi="Helvetica"/>
-                <w:b/>
-                <w:color w:val="F5B82E"/>
-                <w:sz w:val="16"/>
-              </w:rPr>
-              <w:t xml:space="preserve">■ </w:t>
+              <w:t xml:space="preserve">▮ </w:t>
             </w:r>
             <w:r>
               <w:rPr>
-                <w:rFonts w:ascii="Helvetica" w:hAnsi="Helvetica"/>
-                <w:b w:val="0"/>
-                <w:color w:val="1B2738"/>
-                <w:sz w:val="18"/>
+                <w:rFonts w:ascii="Barlow Condensed" w:hAnsi="Barlow Condensed" w:cs="Barlow Condensed"/>
+                <w:b/>
+                <w:i w:val="0"/>
+                <w:color w:val="022429"/>
+                <w:sz w:val="26"/>
+                <w:spacing w:val="70"/>
               </w:rPr>
-              <w:t>Fiber laser cutting (up to 1/2")</w:t>
-            </w:r>
-          </w:p>
-          <w:p>
-            <w:pPr>
-              <w:spacing w:before="0" w:after="0" w:line="276" w:lineRule="auto"/>
-              <w:ind w:left="115"/>
-            </w:pPr>
-            <w:r>
-              <w:rPr>
-                <w:rFonts w:ascii="Helvetica" w:hAnsi="Helvetica"/>
-                <w:b/>
-                <w:color w:val="F5B82E"/>
-                <w:sz w:val="16"/>
-              </w:rPr>
-              <w:t xml:space="preserve">■ </w:t>
+              <w:t xml:space="preserve">CORE CAPABILITIES   </w:t>
             </w:r>
             <w:r>
               <w:rPr>
-                <w:rFonts w:ascii="Helvetica" w:hAnsi="Helvetica"/>
+                <w:rFonts w:ascii="Figtree" w:hAnsi="Figtree" w:cs="Figtree"/>
                 <w:b w:val="0"/>
-                <w:color w:val="1B2738"/>
+                <w:i/>
+                <w:color w:val="022429"/>
                 <w:sz w:val="18"/>
               </w:rPr>
-              <w:t>CNC press brake forming</w:t>
-            </w:r>
-          </w:p>
-          <w:p>
-            <w:pPr>
-              <w:spacing w:before="0" w:after="0" w:line="276" w:lineRule="auto"/>
-              <w:ind w:left="115"/>
-            </w:pPr>
-            <w:r>
-              <w:rPr>
-                <w:rFonts w:ascii="Helvetica" w:hAnsi="Helvetica"/>
-                <w:b/>
-                <w:color w:val="F5B82E"/>
-                <w:sz w:val="16"/>
-              </w:rPr>
-              <w:t xml:space="preserve">■ </w:t>
-            </w:r>
-            <w:r>
-              <w:rPr>
-                <w:rFonts w:ascii="Helvetica" w:hAnsi="Helvetica"/>
-                <w:b w:val="0"/>
-                <w:color w:val="1B2738"/>
-                <w:sz w:val="18"/>
-              </w:rPr>
-              <w:t>MIG / TIG / spot welding</w:t>
-            </w:r>
-          </w:p>
-          <w:p>
-            <w:pPr>
-              <w:spacing w:before="0" w:after="0" w:line="276" w:lineRule="auto"/>
-              <w:ind w:left="115"/>
-            </w:pPr>
-            <w:r>
-              <w:rPr>
-                <w:rFonts w:ascii="Helvetica" w:hAnsi="Helvetica"/>
-                <w:b/>
-                <w:color w:val="F5B82E"/>
-                <w:sz w:val="16"/>
-              </w:rPr>
-              <w:t xml:space="preserve">■ </w:t>
-            </w:r>
-            <w:r>
-              <w:rPr>
-                <w:rFonts w:ascii="Helvetica" w:hAnsi="Helvetica"/>
-                <w:b w:val="0"/>
-                <w:color w:val="1B2738"/>
-                <w:sz w:val="18"/>
-              </w:rPr>
-              <w:t>Powder coat &amp; wet paint</w:t>
-            </w:r>
-          </w:p>
-          <w:p>
-            <w:pPr>
-              <w:spacing w:before="0" w:after="0" w:line="276" w:lineRule="auto"/>
-              <w:ind w:left="115"/>
-            </w:pPr>
-            <w:r>
-              <w:rPr>
-                <w:rFonts w:ascii="Helvetica" w:hAnsi="Helvetica"/>
-                <w:b/>
-                <w:color w:val="F5B82E"/>
-                <w:sz w:val="16"/>
-              </w:rPr>
-              <w:t xml:space="preserve">■ </w:t>
-            </w:r>
-            <w:r>
-              <w:rPr>
-                <w:rFonts w:ascii="Helvetica" w:hAnsi="Helvetica"/>
-                <w:b w:val="0"/>
-                <w:color w:val="1B2738"/>
-                <w:sz w:val="18"/>
-              </w:rPr>
-              <w:t>Grinding, deburring, polishing</w:t>
-            </w:r>
-          </w:p>
-          <w:p>
-            <w:pPr>
-              <w:spacing w:before="0" w:after="40" w:line="276" w:lineRule="auto"/>
-            </w:pPr>
-          </w:p>
-        </w:tc>
-        <w:tc>
-          <w:tcPr>
-            <w:tcW w:type="dxa" w:w="3499"/>
-            <w:shd w:val="clear" w:color="auto" w:fill="FFFDF5"/>
-            <w:tcBorders>
-              <w:top w:val="single" w:sz="4" w:space="0" w:color="E5DDC0"/>
-              <w:left w:val="single" w:sz="36" w:space="0" w:color="F5B82E"/>
-              <w:bottom w:val="single" w:sz="4" w:space="0" w:color="E5DDC0"/>
-              <w:right w:val="single" w:sz="4" w:space="0" w:color="E5DDC0"/>
-            </w:tcBorders>
-          </w:tcPr>
-          <w:p>
-            <w:pPr>
-              <w:spacing w:before="40" w:after="0" w:line="276" w:lineRule="auto"/>
-            </w:pPr>
-            <w:r>
-              <w:rPr>
-                <w:rFonts w:ascii="Helvetica" w:hAnsi="Helvetica"/>
-                <w:b/>
-                <w:color w:val="1B2738"/>
-                <w:sz w:val="24"/>
-              </w:rPr>
-              <w:t>Assembly</w:t>
-            </w:r>
-          </w:p>
-          <w:p>
-            <w:pPr>
-              <w:spacing w:before="40" w:after="80" w:line="276" w:lineRule="auto"/>
-            </w:pPr>
-            <w:r>
-              <w:rPr>
-                <w:rFonts w:ascii="Helvetica" w:hAnsi="Helvetica"/>
-                <w:b w:val="0"/>
-                <w:color w:val="1B2738"/>
-                <w:sz w:val="18"/>
-              </w:rPr>
-              <w:t>Sub-assembly and finished-goods build with mechanical, electrical, and pneumatic integration.</w:t>
-            </w:r>
-          </w:p>
-          <w:p>
-            <w:pPr>
-              <w:spacing w:before="0" w:after="0" w:line="276" w:lineRule="auto"/>
-              <w:ind w:left="115"/>
-            </w:pPr>
-            <w:r>
-              <w:rPr>
-                <w:rFonts w:ascii="Helvetica" w:hAnsi="Helvetica"/>
-                <w:b/>
-                <w:color w:val="F5B82E"/>
-                <w:sz w:val="16"/>
-              </w:rPr>
-              <w:t xml:space="preserve">■ </w:t>
-            </w:r>
-            <w:r>
-              <w:rPr>
-                <w:rFonts w:ascii="Helvetica" w:hAnsi="Helvetica"/>
-                <w:b w:val="0"/>
-                <w:color w:val="1B2738"/>
-                <w:sz w:val="18"/>
-              </w:rPr>
-              <w:t>Mechanical &amp; fastener assembly</w:t>
-            </w:r>
-          </w:p>
-          <w:p>
-            <w:pPr>
-              <w:spacing w:before="0" w:after="0" w:line="276" w:lineRule="auto"/>
-              <w:ind w:left="115"/>
-            </w:pPr>
-            <w:r>
-              <w:rPr>
-                <w:rFonts w:ascii="Helvetica" w:hAnsi="Helvetica"/>
-                <w:b/>
-                <w:color w:val="F5B82E"/>
-                <w:sz w:val="16"/>
-              </w:rPr>
-              <w:t xml:space="preserve">■ </w:t>
-            </w:r>
-            <w:r>
-              <w:rPr>
-                <w:rFonts w:ascii="Helvetica" w:hAnsi="Helvetica"/>
-                <w:b w:val="0"/>
-                <w:color w:val="1B2738"/>
-                <w:sz w:val="18"/>
-              </w:rPr>
-              <w:t>Electrical harness &amp; panel build</w:t>
-            </w:r>
-          </w:p>
-          <w:p>
-            <w:pPr>
-              <w:spacing w:before="0" w:after="0" w:line="276" w:lineRule="auto"/>
-              <w:ind w:left="115"/>
-            </w:pPr>
-            <w:r>
-              <w:rPr>
-                <w:rFonts w:ascii="Helvetica" w:hAnsi="Helvetica"/>
-                <w:b/>
-                <w:color w:val="F5B82E"/>
-                <w:sz w:val="16"/>
-              </w:rPr>
-              <w:t xml:space="preserve">■ </w:t>
-            </w:r>
-            <w:r>
-              <w:rPr>
-                <w:rFonts w:ascii="Helvetica" w:hAnsi="Helvetica"/>
-                <w:b w:val="0"/>
-                <w:color w:val="1B2738"/>
-                <w:sz w:val="18"/>
-              </w:rPr>
-              <w:t>Pneumatic / hydraulic integration</w:t>
-            </w:r>
-          </w:p>
-          <w:p>
-            <w:pPr>
-              <w:spacing w:before="0" w:after="0" w:line="276" w:lineRule="auto"/>
-              <w:ind w:left="115"/>
-            </w:pPr>
-            <w:r>
-              <w:rPr>
-                <w:rFonts w:ascii="Helvetica" w:hAnsi="Helvetica"/>
-                <w:b/>
-                <w:color w:val="F5B82E"/>
-                <w:sz w:val="16"/>
-              </w:rPr>
-              <w:t xml:space="preserve">■ </w:t>
-            </w:r>
-            <w:r>
-              <w:rPr>
-                <w:rFonts w:ascii="Helvetica" w:hAnsi="Helvetica"/>
-                <w:b w:val="0"/>
-                <w:color w:val="1B2738"/>
-                <w:sz w:val="18"/>
-              </w:rPr>
-              <w:t>Functional test &amp; QA</w:t>
-            </w:r>
-          </w:p>
-          <w:p>
-            <w:pPr>
-              <w:spacing w:before="0" w:after="0" w:line="276" w:lineRule="auto"/>
-              <w:ind w:left="115"/>
-            </w:pPr>
-            <w:r>
-              <w:rPr>
-                <w:rFonts w:ascii="Helvetica" w:hAnsi="Helvetica"/>
-                <w:b/>
-                <w:color w:val="F5B82E"/>
-                <w:sz w:val="16"/>
-              </w:rPr>
-              <w:t xml:space="preserve">■ </w:t>
-            </w:r>
-            <w:r>
-              <w:rPr>
-                <w:rFonts w:ascii="Helvetica" w:hAnsi="Helvetica"/>
-                <w:b w:val="0"/>
-                <w:color w:val="1B2738"/>
-                <w:sz w:val="18"/>
-              </w:rPr>
-              <w:t>Kitting &amp; final packaging</w:t>
-            </w:r>
-          </w:p>
-          <w:p>
-            <w:pPr>
-              <w:spacing w:before="0" w:after="40" w:line="276" w:lineRule="auto"/>
-            </w:pPr>
-          </w:p>
-        </w:tc>
-        <w:tc>
-          <w:tcPr>
-            <w:tcW w:type="dxa" w:w="3499"/>
-            <w:shd w:val="clear" w:color="auto" w:fill="FFFDF5"/>
-            <w:tcBorders>
-              <w:top w:val="single" w:sz="4" w:space="0" w:color="E5DDC0"/>
-              <w:left w:val="single" w:sz="36" w:space="0" w:color="F5B82E"/>
-              <w:bottom w:val="single" w:sz="4" w:space="0" w:color="E5DDC0"/>
-              <w:right w:val="single" w:sz="4" w:space="0" w:color="E5DDC0"/>
-            </w:tcBorders>
-          </w:tcPr>
-          <w:p>
-            <w:pPr>
-              <w:spacing w:before="40" w:after="0" w:line="276" w:lineRule="auto"/>
-            </w:pPr>
-            <w:r>
-              <w:rPr>
-                <w:rFonts w:ascii="Helvetica" w:hAnsi="Helvetica"/>
-                <w:b/>
-                <w:color w:val="1B2738"/>
-                <w:sz w:val="24"/>
-              </w:rPr>
-              <w:t>Prototyping &amp; DigiFab</w:t>
-            </w:r>
-          </w:p>
-          <w:p>
-            <w:pPr>
-              <w:spacing w:before="40" w:after="80" w:line="276" w:lineRule="auto"/>
-            </w:pPr>
-            <w:r>
-              <w:rPr>
-                <w:rFonts w:ascii="Helvetica" w:hAnsi="Helvetica"/>
-                <w:b w:val="0"/>
-                <w:color w:val="1B2738"/>
-                <w:sz w:val="18"/>
-              </w:rPr>
-              <w:t>Rapid iteration with digital fabrication for fast turns on form, fit, and function.</w:t>
-            </w:r>
-          </w:p>
-          <w:p>
-            <w:pPr>
-              <w:spacing w:before="0" w:after="0" w:line="276" w:lineRule="auto"/>
-              <w:ind w:left="115"/>
-            </w:pPr>
-            <w:r>
-              <w:rPr>
-                <w:rFonts w:ascii="Helvetica" w:hAnsi="Helvetica"/>
-                <w:b/>
-                <w:color w:val="F5B82E"/>
-                <w:sz w:val="16"/>
-              </w:rPr>
-              <w:t xml:space="preserve">■ </w:t>
-            </w:r>
-            <w:r>
-              <w:rPr>
-                <w:rFonts w:ascii="Helvetica" w:hAnsi="Helvetica"/>
-                <w:b w:val="0"/>
-                <w:color w:val="1B2738"/>
-                <w:sz w:val="18"/>
-              </w:rPr>
-              <w:t>3D printing (FDM, SLA, SLS)</w:t>
-            </w:r>
-          </w:p>
-          <w:p>
-            <w:pPr>
-              <w:spacing w:before="0" w:after="0" w:line="276" w:lineRule="auto"/>
-              <w:ind w:left="115"/>
-            </w:pPr>
-            <w:r>
-              <w:rPr>
-                <w:rFonts w:ascii="Helvetica" w:hAnsi="Helvetica"/>
-                <w:b/>
-                <w:color w:val="F5B82E"/>
-                <w:sz w:val="16"/>
-              </w:rPr>
-              <w:t xml:space="preserve">■ </w:t>
-            </w:r>
-            <w:r>
-              <w:rPr>
-                <w:rFonts w:ascii="Helvetica" w:hAnsi="Helvetica"/>
-                <w:b w:val="0"/>
-                <w:color w:val="1B2738"/>
-                <w:sz w:val="18"/>
-              </w:rPr>
-              <w:t>CNC routing &amp; milling</w:t>
-            </w:r>
-          </w:p>
-          <w:p>
-            <w:pPr>
-              <w:spacing w:before="0" w:after="0" w:line="276" w:lineRule="auto"/>
-              <w:ind w:left="115"/>
-            </w:pPr>
-            <w:r>
-              <w:rPr>
-                <w:rFonts w:ascii="Helvetica" w:hAnsi="Helvetica"/>
-                <w:b/>
-                <w:color w:val="F5B82E"/>
-                <w:sz w:val="16"/>
-              </w:rPr>
-              <w:t xml:space="preserve">■ </w:t>
-            </w:r>
-            <w:r>
-              <w:rPr>
-                <w:rFonts w:ascii="Helvetica" w:hAnsi="Helvetica"/>
-                <w:b w:val="0"/>
-                <w:color w:val="1B2738"/>
-                <w:sz w:val="18"/>
-              </w:rPr>
-              <w:t>Laser engraving &amp; cutting</w:t>
-            </w:r>
-          </w:p>
-          <w:p>
-            <w:pPr>
-              <w:spacing w:before="0" w:after="0" w:line="276" w:lineRule="auto"/>
-              <w:ind w:left="115"/>
-            </w:pPr>
-            <w:r>
-              <w:rPr>
-                <w:rFonts w:ascii="Helvetica" w:hAnsi="Helvetica"/>
-                <w:b/>
-                <w:color w:val="F5B82E"/>
-                <w:sz w:val="16"/>
-              </w:rPr>
-              <w:t xml:space="preserve">■ </w:t>
-            </w:r>
-            <w:r>
-              <w:rPr>
-                <w:rFonts w:ascii="Helvetica" w:hAnsi="Helvetica"/>
-                <w:b w:val="0"/>
-                <w:color w:val="1B2738"/>
-                <w:sz w:val="18"/>
-              </w:rPr>
-              <w:t>DFM review &amp; design support</w:t>
-            </w:r>
-          </w:p>
-          <w:p>
-            <w:pPr>
-              <w:spacing w:before="0" w:after="0" w:line="276" w:lineRule="auto"/>
-              <w:ind w:left="115"/>
-            </w:pPr>
-            <w:r>
-              <w:rPr>
-                <w:rFonts w:ascii="Helvetica" w:hAnsi="Helvetica"/>
-                <w:b/>
-                <w:color w:val="F5B82E"/>
-                <w:sz w:val="16"/>
-              </w:rPr>
-              <w:t xml:space="preserve">■ </w:t>
-            </w:r>
-            <w:r>
-              <w:rPr>
-                <w:rFonts w:ascii="Helvetica" w:hAnsi="Helvetica"/>
-                <w:b w:val="0"/>
-                <w:color w:val="1B2738"/>
-                <w:sz w:val="18"/>
-              </w:rPr>
-              <w:t>Low-volume pilot runs</w:t>
-            </w:r>
-          </w:p>
-          <w:p>
-            <w:pPr>
-              <w:spacing w:before="0" w:after="40" w:line="276" w:lineRule="auto"/>
-            </w:pPr>
-          </w:p>
-        </w:tc>
-      </w:tr>
-    </w:tbl>
-    <w:p>
-      <w:pPr>
-        <w:spacing w:before="160" w:after="80" w:line="276" w:lineRule="auto"/>
-      </w:pPr>
-      <w:r>
-        <w:rPr>
-          <w:rFonts w:ascii="Helvetica" w:hAnsi="Helvetica"/>
-          <w:b/>
-          <w:color w:val="1B2738"/>
-          <w:sz w:val="18"/>
-          <w:spacing w:val="50"/>
-        </w:rPr>
-        <w:t>WAREHOUSING &amp; LOGISTICS</w:t>
-      </w:r>
-    </w:p>
-    <w:tbl>
-      <w:tblPr>
-        <w:tblW w:type="auto" w:w="0"/>
-        <w:tblLayout w:type="fixed"/>
-        <w:tblLook w:firstColumn="1" w:firstRow="1" w:lastColumn="0" w:lastRow="0" w:noHBand="0" w:noVBand="1" w:val="04A0"/>
-      </w:tblPr>
-      <w:tblGrid>
-        <w:gridCol w:w="2448"/>
-        <w:gridCol w:w="8208"/>
-      </w:tblGrid>
-      <w:tr>
-        <w:tc>
-          <w:tcPr>
-            <w:tcW w:type="dxa" w:w="2448"/>
-            <w:shd w:val="clear" w:color="auto" w:fill="FFFDF5"/>
-            <w:tcBorders>
-              <w:top w:val="single" w:sz="4" w:space="0" w:color="E5DDC0"/>
-              <w:left w:val="single" w:sz="36" w:space="0" w:color="1B2738"/>
-              <w:bottom w:val="single" w:sz="4" w:space="0" w:color="E5DDC0"/>
-              <w:right w:val="nil" w:sz="4" w:space="0" w:color="000000"/>
-            </w:tcBorders>
-          </w:tcPr>
-          <w:p>
-            <w:pPr>
-              <w:spacing w:before="40" w:after="0" w:line="276" w:lineRule="auto"/>
-            </w:pPr>
-            <w:r>
-              <w:rPr>
-                <w:rFonts w:ascii="Helvetica" w:hAnsi="Helvetica"/>
-                <w:b/>
-                <w:color w:val="1B2738"/>
-                <w:sz w:val="22"/>
-              </w:rPr>
-              <w:t>One roof, end to end.</w:t>
-            </w:r>
-          </w:p>
-          <w:p>
-            <w:pPr>
-              <w:spacing w:before="0" w:after="0" w:line="276" w:lineRule="auto"/>
-            </w:pPr>
-            <w:r>
-              <w:rPr>
-                <w:rFonts w:ascii="Helvetica" w:hAnsi="Helvetica"/>
-                <w:b w:val="0"/>
-                <w:color w:val="1B2738"/>
-                <w:sz w:val="16"/>
-              </w:rPr>
-              <w:t>42,000 sq ft Detroit facility</w:t>
-            </w:r>
-          </w:p>
-        </w:tc>
-        <w:tc>
-          <w:tcPr>
-            <w:tcW w:type="dxa" w:w="8208"/>
-            <w:shd w:val="clear" w:color="auto" w:fill="FFFDF5"/>
-            <w:tcBorders>
-              <w:top w:val="single" w:sz="4" w:space="0" w:color="E5DDC0"/>
-              <w:left w:val="nil" w:sz="4" w:space="0" w:color="000000"/>
-              <w:bottom w:val="single" w:sz="4" w:space="0" w:color="E5DDC0"/>
-              <w:right w:val="single" w:sz="4" w:space="0" w:color="E5DDC0"/>
-            </w:tcBorders>
-          </w:tcPr>
-          <w:p>
-            <w:pPr>
-              <w:spacing w:before="40" w:after="0" w:line="276" w:lineRule="auto"/>
-            </w:pPr>
-            <w:r>
-              <w:rPr>
-                <w:rFonts w:ascii="Helvetica" w:hAnsi="Helvetica"/>
-                <w:b w:val="0"/>
-                <w:color w:val="1B2738"/>
-                <w:sz w:val="18"/>
-              </w:rPr>
-              <w:t>On-site warehousing, inventory programs, and outbound logistics keep your supply chain tight. We hold stock, manage Kanban replenishment, and ship direct to your line, your customer, or your DC.</w:t>
-            </w:r>
-          </w:p>
-          <w:p>
-            <w:pPr>
-              <w:spacing w:before="80" w:after="0" w:line="276" w:lineRule="auto"/>
-            </w:pPr>
-            <w:r>
-              <w:rPr>
-                <w:rFonts w:ascii="Helvetica" w:hAnsi="Helvetica"/>
-                <w:b/>
-                <w:color w:val="1B2738"/>
-                <w:sz w:val="16"/>
-                <w:spacing w:val="20"/>
-                <w:shd w:val="clear" w:color="auto" w:fill="F5B82E"/>
-              </w:rPr>
-              <w:t xml:space="preserve">  PICK &amp; PACK  </w:t>
-            </w:r>
-            <w:r>
-              <w:rPr>
-                <w:rFonts w:ascii="Helvetica" w:hAnsi="Helvetica"/>
-                <w:b w:val="0"/>
-                <w:color w:val="1B2738"/>
-                <w:sz w:val="16"/>
-              </w:rPr>
-              <w:t xml:space="preserve">  </w:t>
-            </w:r>
-            <w:r>
-              <w:rPr>
-                <w:rFonts w:ascii="Helvetica" w:hAnsi="Helvetica"/>
-                <w:b/>
-                <w:color w:val="1B2738"/>
-                <w:sz w:val="16"/>
-                <w:spacing w:val="20"/>
-                <w:shd w:val="clear" w:color="auto" w:fill="F5B82E"/>
-              </w:rPr>
-              <w:t xml:space="preserve">  KITTING  </w:t>
-            </w:r>
-            <w:r>
-              <w:rPr>
-                <w:rFonts w:ascii="Helvetica" w:hAnsi="Helvetica"/>
-                <w:b w:val="0"/>
-                <w:color w:val="1B2738"/>
-                <w:sz w:val="16"/>
-              </w:rPr>
-              <w:t xml:space="preserve">  </w:t>
-            </w:r>
-            <w:r>
-              <w:rPr>
-                <w:rFonts w:ascii="Helvetica" w:hAnsi="Helvetica"/>
-                <w:b/>
-                <w:color w:val="1B2738"/>
-                <w:sz w:val="16"/>
-                <w:spacing w:val="20"/>
-                <w:shd w:val="clear" w:color="auto" w:fill="F5B82E"/>
-              </w:rPr>
-              <w:t xml:space="preserve">  KANBAN  </w:t>
-            </w:r>
-            <w:r>
-              <w:rPr>
-                <w:rFonts w:ascii="Helvetica" w:hAnsi="Helvetica"/>
-                <w:b w:val="0"/>
-                <w:color w:val="1B2738"/>
-                <w:sz w:val="16"/>
-              </w:rPr>
-              <w:t xml:space="preserve">  </w:t>
-            </w:r>
-            <w:r>
-              <w:rPr>
-                <w:rFonts w:ascii="Helvetica" w:hAnsi="Helvetica"/>
-                <w:b/>
-                <w:color w:val="1B2738"/>
-                <w:sz w:val="16"/>
-                <w:spacing w:val="20"/>
-                <w:shd w:val="clear" w:color="auto" w:fill="F5B82E"/>
-              </w:rPr>
-              <w:t xml:space="preserve">  VMI  </w:t>
-            </w:r>
-            <w:r>
-              <w:rPr>
-                <w:rFonts w:ascii="Helvetica" w:hAnsi="Helvetica"/>
-                <w:b w:val="0"/>
-                <w:color w:val="1B2738"/>
-                <w:sz w:val="16"/>
-              </w:rPr>
-              <w:t xml:space="preserve">  </w:t>
-            </w:r>
-            <w:r>
-              <w:rPr>
-                <w:rFonts w:ascii="Helvetica" w:hAnsi="Helvetica"/>
-                <w:b/>
-                <w:color w:val="1B2738"/>
-                <w:sz w:val="16"/>
-                <w:spacing w:val="20"/>
-                <w:shd w:val="clear" w:color="auto" w:fill="F5B82E"/>
-              </w:rPr>
-              <w:t xml:space="preserve">  INVENTORY MGMT  </w:t>
-            </w:r>
-            <w:r>
-              <w:rPr>
-                <w:rFonts w:ascii="Helvetica" w:hAnsi="Helvetica"/>
-                <w:b w:val="0"/>
-                <w:color w:val="1B2738"/>
-                <w:sz w:val="16"/>
-              </w:rPr>
-              <w:t xml:space="preserve">  </w:t>
-            </w:r>
-            <w:r>
-              <w:rPr>
-                <w:rFonts w:ascii="Helvetica" w:hAnsi="Helvetica"/>
-                <w:b/>
-                <w:color w:val="1B2738"/>
-                <w:sz w:val="16"/>
-                <w:spacing w:val="20"/>
-              </w:rPr>
-              <w:t>[ LTL / PARCEL ]</w:t>
-            </w:r>
-            <w:r>
-              <w:rPr>
-                <w:rFonts w:ascii="Helvetica" w:hAnsi="Helvetica"/>
-                <w:b w:val="0"/>
-                <w:color w:val="1B2738"/>
-                <w:sz w:val="16"/>
-              </w:rPr>
-              <w:t xml:space="preserve">  </w:t>
-            </w:r>
-            <w:r>
-              <w:rPr>
-                <w:rFonts w:ascii="Helvetica" w:hAnsi="Helvetica"/>
-                <w:b/>
-                <w:color w:val="1B2738"/>
-                <w:sz w:val="16"/>
-                <w:spacing w:val="20"/>
-              </w:rPr>
-              <w:t>[ DROP SHIP ]</w:t>
-            </w:r>
-            <w:r>
-              <w:rPr>
-                <w:rFonts w:ascii="Helvetica" w:hAnsi="Helvetica"/>
-                <w:b w:val="0"/>
-                <w:color w:val="1B2738"/>
-                <w:sz w:val="16"/>
-              </w:rPr>
-              <w:t xml:space="preserve">  </w:t>
-            </w:r>
-            <w:r>
-              <w:rPr>
-                <w:rFonts w:ascii="Helvetica" w:hAnsi="Helvetica"/>
-                <w:b/>
-                <w:color w:val="1B2738"/>
-                <w:sz w:val="16"/>
-                <w:spacing w:val="20"/>
-              </w:rPr>
-              <w:t>[ CROSS-DOCK ]</w:t>
+              <w:t>Fabrication · Assembly · Prototyping</w:t>
             </w:r>
           </w:p>
         </w:tc>
@@ -1030,36 +405,707 @@
         <w:tblW w:type="auto" w:w="0"/>
         <w:tblLayout w:type="fixed"/>
         <w:tblLook w:firstColumn="1" w:firstRow="1" w:lastColumn="0" w:lastRow="0" w:noHBand="0" w:noVBand="1" w:val="04A0"/>
+        <w:tblBorders>
+          <w:top w:val="nil"/>
+          <w:left w:val="nil"/>
+          <w:bottom w:val="nil"/>
+          <w:right w:val="nil"/>
+          <w:insideH w:val="nil"/>
+          <w:insideV w:val="nil"/>
+        </w:tblBorders>
       </w:tblPr>
       <w:tblGrid>
-        <w:gridCol w:w="3499"/>
-        <w:gridCol w:w="3499"/>
-        <w:gridCol w:w="3499"/>
+        <w:gridCol w:w="3542"/>
+        <w:gridCol w:w="3542"/>
+        <w:gridCol w:w="3542"/>
       </w:tblGrid>
       <w:tr>
         <w:tc>
           <w:tcPr>
-            <w:tcW w:type="dxa" w:w="3499"/>
+            <w:tcW w:type="dxa" w:w="3542"/>
+            <w:shd w:val="clear" w:color="auto" w:fill="FFFFFF"/>
             <w:tcBorders>
-              <w:top w:val="single" w:sz="16" w:space="0" w:color="1B2738"/>
-              <w:left w:val="nil" w:sz="4" w:space="0" w:color="000000"/>
+              <w:top w:val="single" w:sz="4" w:space="0" w:color="E8DFC0"/>
+              <w:left w:val="single" w:sz="48" w:space="0" w:color="FDB602"/>
+              <w:bottom w:val="single" w:sz="4" w:space="0" w:color="E8DFC0"/>
+              <w:right w:val="single" w:sz="4" w:space="0" w:color="E8DFC0"/>
+            </w:tcBorders>
+            <w:tcMar>
+              <w:top w:w="140" w:type="dxa"/>
+              <w:left w:w="180" w:type="dxa"/>
+              <w:bottom w:w="140" w:type="dxa"/>
+              <w:right w:w="180" w:type="dxa"/>
+            </w:tcMar>
+          </w:tcPr>
+          <w:p>
+            <w:pPr>
+              <w:spacing w:before="0" w:after="0" w:line="276" w:lineRule="auto"/>
+            </w:pPr>
+            <w:r>
+              <w:rPr>
+                <w:rFonts w:ascii="Barlow Condensed" w:hAnsi="Barlow Condensed" w:cs="Barlow Condensed"/>
+                <w:b/>
+                <w:i w:val="0"/>
+                <w:color w:val="022429"/>
+                <w:sz w:val="20"/>
+                <w:spacing w:val="40"/>
+              </w:rPr>
+              <w:t>01 · FAB</w:t>
+            </w:r>
+          </w:p>
+          <w:p>
+            <w:pPr>
+              <w:spacing w:before="20" w:after="40" w:line="276" w:lineRule="auto"/>
+            </w:pPr>
+            <w:r>
+              <w:rPr>
+                <w:rFonts w:ascii="Barlow Condensed" w:hAnsi="Barlow Condensed" w:cs="Barlow Condensed"/>
+                <w:b/>
+                <w:i w:val="0"/>
+                <w:color w:val="022429"/>
+                <w:sz w:val="34"/>
+              </w:rPr>
+              <w:t>FABRICATION</w:t>
+            </w:r>
+          </w:p>
+          <w:p>
+            <w:pPr>
+              <w:spacing w:before="0" w:after="80" w:line="324" w:lineRule="auto"/>
+            </w:pPr>
+            <w:r>
+              <w:rPr>
+                <w:rFonts w:ascii="Figtree" w:hAnsi="Figtree" w:cs="Figtree"/>
+                <w:b w:val="0"/>
+                <w:i/>
+                <w:color w:val="022429"/>
+                <w:sz w:val="18"/>
+              </w:rPr>
+              <w:t>Cutting, forming, and welding for metal parts and structures.</w:t>
+            </w:r>
+          </w:p>
+          <w:p>
+            <w:pPr>
+              <w:spacing w:before="0" w:after="0" w:line="336" w:lineRule="auto"/>
+              <w:ind w:left="115"/>
+            </w:pPr>
+            <w:r>
+              <w:rPr>
+                <w:rFonts w:ascii="Figtree" w:hAnsi="Figtree" w:cs="Figtree"/>
+                <w:b/>
+                <w:i w:val="0"/>
+                <w:color w:val="FDB602"/>
+                <w:sz w:val="16"/>
+              </w:rPr>
+              <w:t xml:space="preserve">■ </w:t>
+            </w:r>
+            <w:r>
+              <w:rPr>
+                <w:rFonts w:ascii="Figtree" w:hAnsi="Figtree" w:cs="Figtree"/>
+                <w:b/>
+                <w:i w:val="0"/>
+                <w:color w:val="022429"/>
+                <w:sz w:val="19"/>
+              </w:rPr>
+              <w:t>Laser cutting</w:t>
+            </w:r>
+            <w:r>
+              <w:rPr>
+                <w:rFonts w:ascii="Figtree" w:hAnsi="Figtree" w:cs="Figtree"/>
+                <w:b w:val="0"/>
+                <w:i w:val="0"/>
+                <w:color w:val="022429"/>
+                <w:sz w:val="19"/>
+              </w:rPr>
+              <w:t xml:space="preserve"> — tube + flat</w:t>
+            </w:r>
+          </w:p>
+          <w:p>
+            <w:pPr>
+              <w:spacing w:before="0" w:after="0" w:line="336" w:lineRule="auto"/>
+              <w:ind w:left="115"/>
+            </w:pPr>
+            <w:r>
+              <w:rPr>
+                <w:rFonts w:ascii="Figtree" w:hAnsi="Figtree" w:cs="Figtree"/>
+                <w:b/>
+                <w:i w:val="0"/>
+                <w:color w:val="FDB602"/>
+                <w:sz w:val="16"/>
+              </w:rPr>
+              <w:t xml:space="preserve">■ </w:t>
+            </w:r>
+            <w:r>
+              <w:rPr>
+                <w:rFonts w:ascii="Figtree" w:hAnsi="Figtree" w:cs="Figtree"/>
+                <w:b/>
+                <w:i w:val="0"/>
+                <w:color w:val="022429"/>
+                <w:sz w:val="19"/>
+              </w:rPr>
+              <w:t>Forming</w:t>
+            </w:r>
+            <w:r>
+              <w:rPr>
+                <w:rFonts w:ascii="Figtree" w:hAnsi="Figtree" w:cs="Figtree"/>
+                <w:b w:val="0"/>
+                <w:i w:val="0"/>
+                <w:color w:val="022429"/>
+                <w:sz w:val="19"/>
+              </w:rPr>
+              <w:t xml:space="preserve"> — brake press, tube bending, punch &amp; press</w:t>
+            </w:r>
+          </w:p>
+          <w:p>
+            <w:pPr>
+              <w:spacing w:before="0" w:after="0" w:line="336" w:lineRule="auto"/>
+              <w:ind w:left="115"/>
+            </w:pPr>
+            <w:r>
+              <w:rPr>
+                <w:rFonts w:ascii="Figtree" w:hAnsi="Figtree" w:cs="Figtree"/>
+                <w:b/>
+                <w:i w:val="0"/>
+                <w:color w:val="FDB602"/>
+                <w:sz w:val="16"/>
+              </w:rPr>
+              <w:t xml:space="preserve">■ </w:t>
+            </w:r>
+            <w:r>
+              <w:rPr>
+                <w:rFonts w:ascii="Figtree" w:hAnsi="Figtree" w:cs="Figtree"/>
+                <w:b/>
+                <w:i w:val="0"/>
+                <w:color w:val="022429"/>
+                <w:sz w:val="19"/>
+              </w:rPr>
+              <w:t>Welding</w:t>
+            </w:r>
+            <w:r>
+              <w:rPr>
+                <w:rFonts w:ascii="Figtree" w:hAnsi="Figtree" w:cs="Figtree"/>
+                <w:b w:val="0"/>
+                <w:i w:val="0"/>
+                <w:color w:val="022429"/>
+                <w:sz w:val="19"/>
+              </w:rPr>
+              <w:t xml:space="preserve"> — MIG / TIG / laser + robotic</w:t>
+            </w:r>
+          </w:p>
+          <w:p>
+            <w:pPr>
+              <w:spacing w:before="0" w:after="0" w:line="336" w:lineRule="auto"/>
+              <w:ind w:left="115"/>
+            </w:pPr>
+            <w:r>
+              <w:rPr>
+                <w:rFonts w:ascii="Figtree" w:hAnsi="Figtree" w:cs="Figtree"/>
+                <w:b/>
+                <w:i w:val="0"/>
+                <w:color w:val="FDB602"/>
+                <w:sz w:val="16"/>
+              </w:rPr>
+              <w:t xml:space="preserve">■ </w:t>
+            </w:r>
+            <w:r>
+              <w:rPr>
+                <w:rFonts w:ascii="Figtree" w:hAnsi="Figtree" w:cs="Figtree"/>
+                <w:b/>
+                <w:i w:val="0"/>
+                <w:color w:val="022429"/>
+                <w:sz w:val="19"/>
+              </w:rPr>
+              <w:t>Short runs</w:t>
+            </w:r>
+            <w:r>
+              <w:rPr>
+                <w:rFonts w:ascii="Figtree" w:hAnsi="Figtree" w:cs="Figtree"/>
+                <w:b w:val="0"/>
+                <w:i w:val="0"/>
+                <w:color w:val="022429"/>
+                <w:sz w:val="19"/>
+              </w:rPr>
+              <w:t xml:space="preserve"> — jigs &amp; fixtures for repeatability</w:t>
+            </w:r>
+          </w:p>
+        </w:tc>
+        <w:tc>
+          <w:tcPr>
+            <w:tcW w:type="dxa" w:w="3542"/>
+            <w:shd w:val="clear" w:color="auto" w:fill="FFFFFF"/>
+            <w:tcBorders>
+              <w:top w:val="single" w:sz="4" w:space="0" w:color="E8DFC0"/>
+              <w:left w:val="single" w:sz="48" w:space="0" w:color="FDB602"/>
+              <w:bottom w:val="single" w:sz="4" w:space="0" w:color="E8DFC0"/>
+              <w:right w:val="single" w:sz="4" w:space="0" w:color="E8DFC0"/>
+            </w:tcBorders>
+            <w:tcMar>
+              <w:top w:w="140" w:type="dxa"/>
+              <w:left w:w="180" w:type="dxa"/>
+              <w:bottom w:w="140" w:type="dxa"/>
+              <w:right w:w="180" w:type="dxa"/>
+            </w:tcMar>
+          </w:tcPr>
+          <w:p>
+            <w:pPr>
+              <w:spacing w:before="0" w:after="0" w:line="276" w:lineRule="auto"/>
+            </w:pPr>
+            <w:r>
+              <w:rPr>
+                <w:rFonts w:ascii="Barlow Condensed" w:hAnsi="Barlow Condensed" w:cs="Barlow Condensed"/>
+                <w:b/>
+                <w:i w:val="0"/>
+                <w:color w:val="022429"/>
+                <w:sz w:val="20"/>
+                <w:spacing w:val="40"/>
+              </w:rPr>
+              <w:t>02 · ASM</w:t>
+            </w:r>
+          </w:p>
+          <w:p>
+            <w:pPr>
+              <w:spacing w:before="20" w:after="40" w:line="276" w:lineRule="auto"/>
+            </w:pPr>
+            <w:r>
+              <w:rPr>
+                <w:rFonts w:ascii="Barlow Condensed" w:hAnsi="Barlow Condensed" w:cs="Barlow Condensed"/>
+                <w:b/>
+                <w:i w:val="0"/>
+                <w:color w:val="022429"/>
+                <w:sz w:val="34"/>
+              </w:rPr>
+              <w:t>ASSEMBLY</w:t>
+            </w:r>
+          </w:p>
+          <w:p>
+            <w:pPr>
+              <w:spacing w:before="0" w:after="80" w:line="324" w:lineRule="auto"/>
+            </w:pPr>
+            <w:r>
+              <w:rPr>
+                <w:rFonts w:ascii="Figtree" w:hAnsi="Figtree" w:cs="Figtree"/>
+                <w:b w:val="0"/>
+                <w:i/>
+                <w:color w:val="022429"/>
+                <w:sz w:val="18"/>
+              </w:rPr>
+              <w:t>Kitting, sub-assembly, full builds — and everything in between.</w:t>
+            </w:r>
+          </w:p>
+          <w:p>
+            <w:pPr>
+              <w:spacing w:before="0" w:after="0" w:line="336" w:lineRule="auto"/>
+              <w:ind w:left="115"/>
+            </w:pPr>
+            <w:r>
+              <w:rPr>
+                <w:rFonts w:ascii="Figtree" w:hAnsi="Figtree" w:cs="Figtree"/>
+                <w:b/>
+                <w:i w:val="0"/>
+                <w:color w:val="FDB602"/>
+                <w:sz w:val="16"/>
+              </w:rPr>
+              <w:t xml:space="preserve">■ </w:t>
+            </w:r>
+            <w:r>
+              <w:rPr>
+                <w:rFonts w:ascii="Figtree" w:hAnsi="Figtree" w:cs="Figtree"/>
+                <w:b w:val="0"/>
+                <w:i w:val="0"/>
+                <w:color w:val="022429"/>
+                <w:sz w:val="19"/>
+              </w:rPr>
+              <w:t>Kitting + sub-assembly + final assembly</w:t>
+            </w:r>
+          </w:p>
+          <w:p>
+            <w:pPr>
+              <w:spacing w:before="0" w:after="0" w:line="336" w:lineRule="auto"/>
+              <w:ind w:left="115"/>
+            </w:pPr>
+            <w:r>
+              <w:rPr>
+                <w:rFonts w:ascii="Figtree" w:hAnsi="Figtree" w:cs="Figtree"/>
+                <w:b/>
+                <w:i w:val="0"/>
+                <w:color w:val="FDB602"/>
+                <w:sz w:val="16"/>
+              </w:rPr>
+              <w:t xml:space="preserve">■ </w:t>
+            </w:r>
+            <w:r>
+              <w:rPr>
+                <w:rFonts w:ascii="Figtree" w:hAnsi="Figtree" w:cs="Figtree"/>
+                <w:b w:val="0"/>
+                <w:i w:val="0"/>
+                <w:color w:val="022429"/>
+                <w:sz w:val="19"/>
+              </w:rPr>
+              <w:t>Complete build-ups with CAD / 3xD support</w:t>
+            </w:r>
+          </w:p>
+          <w:p>
+            <w:pPr>
+              <w:spacing w:before="0" w:after="0" w:line="336" w:lineRule="auto"/>
+              <w:ind w:left="115"/>
+            </w:pPr>
+            <w:r>
+              <w:rPr>
+                <w:rFonts w:ascii="Figtree" w:hAnsi="Figtree" w:cs="Figtree"/>
+                <w:b/>
+                <w:i w:val="0"/>
+                <w:color w:val="FDB602"/>
+                <w:sz w:val="16"/>
+              </w:rPr>
+              <w:t xml:space="preserve">■ </w:t>
+            </w:r>
+            <w:r>
+              <w:rPr>
+                <w:rFonts w:ascii="Figtree" w:hAnsi="Figtree" w:cs="Figtree"/>
+                <w:b w:val="0"/>
+                <w:i w:val="0"/>
+                <w:color w:val="022429"/>
+                <w:sz w:val="19"/>
+              </w:rPr>
+              <w:t>Torque &amp; fastener standards · EOL test</w:t>
+            </w:r>
+          </w:p>
+          <w:p>
+            <w:pPr>
+              <w:spacing w:before="0" w:after="0" w:line="336" w:lineRule="auto"/>
+              <w:ind w:left="115"/>
+            </w:pPr>
+            <w:r>
+              <w:rPr>
+                <w:rFonts w:ascii="Figtree" w:hAnsi="Figtree" w:cs="Figtree"/>
+                <w:b/>
+                <w:i w:val="0"/>
+                <w:color w:val="FDB602"/>
+                <w:sz w:val="16"/>
+              </w:rPr>
+              <w:t xml:space="preserve">■ </w:t>
+            </w:r>
+            <w:r>
+              <w:rPr>
+                <w:rFonts w:ascii="Figtree" w:hAnsi="Figtree" w:cs="Figtree"/>
+                <w:b w:val="0"/>
+                <w:i w:val="0"/>
+                <w:color w:val="022429"/>
+                <w:sz w:val="19"/>
+              </w:rPr>
+              <w:t>Quality checks + rework when needed</w:t>
+            </w:r>
+          </w:p>
+        </w:tc>
+        <w:tc>
+          <w:tcPr>
+            <w:tcW w:type="dxa" w:w="3542"/>
+            <w:shd w:val="clear" w:color="auto" w:fill="FFFFFF"/>
+            <w:tcBorders>
+              <w:top w:val="single" w:sz="4" w:space="0" w:color="E8DFC0"/>
+              <w:left w:val="single" w:sz="48" w:space="0" w:color="FDB602"/>
+              <w:bottom w:val="single" w:sz="4" w:space="0" w:color="E8DFC0"/>
+              <w:right w:val="single" w:sz="4" w:space="0" w:color="E8DFC0"/>
+            </w:tcBorders>
+            <w:tcMar>
+              <w:top w:w="140" w:type="dxa"/>
+              <w:left w:w="180" w:type="dxa"/>
+              <w:bottom w:w="140" w:type="dxa"/>
+              <w:right w:w="180" w:type="dxa"/>
+            </w:tcMar>
+          </w:tcPr>
+          <w:p>
+            <w:pPr>
+              <w:spacing w:before="0" w:after="0" w:line="276" w:lineRule="auto"/>
+            </w:pPr>
+            <w:r>
+              <w:rPr>
+                <w:rFonts w:ascii="Barlow Condensed" w:hAnsi="Barlow Condensed" w:cs="Barlow Condensed"/>
+                <w:b/>
+                <w:i w:val="0"/>
+                <w:color w:val="022429"/>
+                <w:sz w:val="20"/>
+                <w:spacing w:val="40"/>
+              </w:rPr>
+              <w:t>03 · PROTO</w:t>
+            </w:r>
+          </w:p>
+          <w:p>
+            <w:pPr>
+              <w:spacing w:before="20" w:after="40" w:line="276" w:lineRule="auto"/>
+            </w:pPr>
+            <w:r>
+              <w:rPr>
+                <w:rFonts w:ascii="Barlow Condensed" w:hAnsi="Barlow Condensed" w:cs="Barlow Condensed"/>
+                <w:b/>
+                <w:i w:val="0"/>
+                <w:color w:val="022429"/>
+                <w:sz w:val="34"/>
+              </w:rPr>
+              <w:t>PROTOTYPING &amp; DIGIFAB</w:t>
+            </w:r>
+          </w:p>
+          <w:p>
+            <w:pPr>
+              <w:spacing w:before="0" w:after="80" w:line="324" w:lineRule="auto"/>
+            </w:pPr>
+            <w:r>
+              <w:rPr>
+                <w:rFonts w:ascii="Figtree" w:hAnsi="Figtree" w:cs="Figtree"/>
+                <w:b w:val="0"/>
+                <w:i/>
+                <w:color w:val="022429"/>
+                <w:sz w:val="18"/>
+              </w:rPr>
+              <w:t>Fast prototypes and fixtures, CAD to part.</w:t>
+            </w:r>
+          </w:p>
+          <w:p>
+            <w:pPr>
+              <w:spacing w:before="0" w:after="0" w:line="336" w:lineRule="auto"/>
+              <w:ind w:left="115"/>
+            </w:pPr>
+            <w:r>
+              <w:rPr>
+                <w:rFonts w:ascii="Figtree" w:hAnsi="Figtree" w:cs="Figtree"/>
+                <w:b/>
+                <w:i w:val="0"/>
+                <w:color w:val="FDB602"/>
+                <w:sz w:val="16"/>
+              </w:rPr>
+              <w:t xml:space="preserve">■ </w:t>
+            </w:r>
+            <w:r>
+              <w:rPr>
+                <w:rFonts w:ascii="Figtree" w:hAnsi="Figtree" w:cs="Figtree"/>
+                <w:b/>
+                <w:i w:val="0"/>
+                <w:color w:val="022429"/>
+                <w:sz w:val="19"/>
+              </w:rPr>
+              <w:t>3D printing</w:t>
+            </w:r>
+            <w:r>
+              <w:rPr>
+                <w:rFonts w:ascii="Figtree" w:hAnsi="Figtree" w:cs="Figtree"/>
+                <w:b w:val="0"/>
+                <w:i w:val="0"/>
+                <w:color w:val="022429"/>
+                <w:sz w:val="19"/>
+              </w:rPr>
+              <w:t xml:space="preserve"> — FDM, SLA, SLS (EOS)</w:t>
+            </w:r>
+          </w:p>
+          <w:p>
+            <w:pPr>
+              <w:spacing w:before="0" w:after="0" w:line="336" w:lineRule="auto"/>
+              <w:ind w:left="115"/>
+            </w:pPr>
+            <w:r>
+              <w:rPr>
+                <w:rFonts w:ascii="Figtree" w:hAnsi="Figtree" w:cs="Figtree"/>
+                <w:b/>
+                <w:i w:val="0"/>
+                <w:color w:val="FDB602"/>
+                <w:sz w:val="16"/>
+              </w:rPr>
+              <w:t xml:space="preserve">■ </w:t>
+            </w:r>
+            <w:r>
+              <w:rPr>
+                <w:rFonts w:ascii="Figtree" w:hAnsi="Figtree" w:cs="Figtree"/>
+                <w:b w:val="0"/>
+                <w:i w:val="0"/>
+                <w:color w:val="022429"/>
+                <w:sz w:val="19"/>
+              </w:rPr>
+              <w:t>Quick jigs, check-fixtures, POCs, mockups</w:t>
+            </w:r>
+          </w:p>
+          <w:p>
+            <w:pPr>
+              <w:spacing w:before="0" w:after="0" w:line="336" w:lineRule="auto"/>
+              <w:ind w:left="115"/>
+            </w:pPr>
+            <w:r>
+              <w:rPr>
+                <w:rFonts w:ascii="Figtree" w:hAnsi="Figtree" w:cs="Figtree"/>
+                <w:b/>
+                <w:i w:val="0"/>
+                <w:color w:val="FDB602"/>
+                <w:sz w:val="16"/>
+              </w:rPr>
+              <w:t xml:space="preserve">■ </w:t>
+            </w:r>
+            <w:r>
+              <w:rPr>
+                <w:rFonts w:ascii="Figtree" w:hAnsi="Figtree" w:cs="Figtree"/>
+                <w:b w:val="0"/>
+                <w:i w:val="0"/>
+                <w:color w:val="022429"/>
+                <w:sz w:val="19"/>
+              </w:rPr>
+              <w:t>Same-week iteration on form, fit, function</w:t>
+            </w:r>
+          </w:p>
+          <w:p>
+            <w:pPr>
+              <w:spacing w:before="0" w:after="0" w:line="336" w:lineRule="auto"/>
+              <w:ind w:left="115"/>
+            </w:pPr>
+            <w:r>
+              <w:rPr>
+                <w:rFonts w:ascii="Figtree" w:hAnsi="Figtree" w:cs="Figtree"/>
+                <w:b/>
+                <w:i w:val="0"/>
+                <w:color w:val="FDB602"/>
+                <w:sz w:val="16"/>
+              </w:rPr>
+              <w:t xml:space="preserve">■ </w:t>
+            </w:r>
+            <w:r>
+              <w:rPr>
+                <w:rFonts w:ascii="Figtree" w:hAnsi="Figtree" w:cs="Figtree"/>
+                <w:b w:val="0"/>
+                <w:i w:val="0"/>
+                <w:color w:val="022429"/>
+                <w:sz w:val="19"/>
+              </w:rPr>
+              <w:t>Design-for-manufacture review &amp; support</w:t>
+            </w:r>
+          </w:p>
+        </w:tc>
+      </w:tr>
+    </w:tbl>
+    <w:p>
+      <w:pPr>
+        <w:spacing w:before="0" w:after="40" w:line="276" w:lineRule="auto"/>
+      </w:pPr>
+    </w:p>
+    <w:tbl>
+      <w:tblPr>
+        <w:tblW w:type="auto" w:w="0"/>
+        <w:tblLayout w:type="fixed"/>
+        <w:tblLook w:firstColumn="1" w:firstRow="1" w:lastColumn="0" w:lastRow="0" w:noHBand="0" w:noVBand="1" w:val="04A0"/>
+        <w:tblBorders>
+          <w:top w:val="nil"/>
+          <w:left w:val="nil"/>
+          <w:bottom w:val="nil"/>
+          <w:right w:val="nil"/>
+          <w:insideH w:val="nil"/>
+          <w:insideV w:val="nil"/>
+        </w:tblBorders>
+      </w:tblPr>
+      <w:tblGrid>
+        <w:gridCol w:w="10800"/>
+      </w:tblGrid>
+      <w:tr>
+        <w:tc>
+          <w:tcPr>
+            <w:tcW w:type="dxa" w:w="10800"/>
+          </w:tcPr>
+          <w:p>
+            <w:pPr>
+              <w:spacing w:before="120" w:after="40" w:line="276" w:lineRule="auto"/>
+            </w:pPr>
+            <w:r>
+              <w:rPr>
+                <w:rFonts w:ascii="Figtree" w:hAnsi="Figtree" w:cs="Figtree"/>
+                <w:b/>
+                <w:i w:val="0"/>
+                <w:color w:val="FDB602"/>
+                <w:sz w:val="28"/>
+              </w:rPr>
+              <w:t xml:space="preserve">▮ </w:t>
+            </w:r>
+            <w:r>
+              <w:rPr>
+                <w:rFonts w:ascii="Barlow Condensed" w:hAnsi="Barlow Condensed" w:cs="Barlow Condensed"/>
+                <w:b/>
+                <w:i w:val="0"/>
+                <w:color w:val="022429"/>
+                <w:sz w:val="26"/>
+                <w:spacing w:val="70"/>
+              </w:rPr>
+              <w:t xml:space="preserve">WAREHOUSING &amp; LOGISTICS   </w:t>
+            </w:r>
+            <w:r>
+              <w:rPr>
+                <w:rFonts w:ascii="Figtree" w:hAnsi="Figtree" w:cs="Figtree"/>
+                <w:b w:val="0"/>
+                <w:i/>
+                <w:color w:val="022429"/>
+                <w:sz w:val="18"/>
+              </w:rPr>
+              <w:t>Products in, products out — without the chaos.</w:t>
+            </w:r>
+          </w:p>
+        </w:tc>
+      </w:tr>
+    </w:tbl>
+    <w:tbl>
+      <w:tblPr>
+        <w:tblW w:type="auto" w:w="0"/>
+        <w:tblLayout w:type="fixed"/>
+        <w:tblLook w:firstColumn="1" w:firstRow="1" w:lastColumn="0" w:lastRow="0" w:noHBand="0" w:noVBand="1" w:val="04A0"/>
+        <w:tblBorders>
+          <w:top w:val="nil"/>
+          <w:left w:val="nil"/>
+          <w:bottom w:val="nil"/>
+          <w:right w:val="nil"/>
+          <w:insideH w:val="nil"/>
+          <w:insideV w:val="nil"/>
+        </w:tblBorders>
+      </w:tblPr>
+      <w:tblGrid>
+        <w:gridCol w:w="2664"/>
+        <w:gridCol w:w="8136"/>
+      </w:tblGrid>
+      <w:tr>
+        <w:tc>
+          <w:tcPr>
+            <w:tcW w:type="dxa" w:w="2664"/>
+            <w:shd w:val="clear" w:color="auto" w:fill="022429"/>
+            <w:tcMar>
+              <w:top w:w="140" w:type="dxa"/>
+              <w:left w:w="160" w:type="dxa"/>
+              <w:bottom w:w="140" w:type="dxa"/>
+              <w:right w:w="140" w:type="dxa"/>
+            </w:tcMar>
+            <w:tcBorders>
+              <w:top w:val="nil" w:sz="4" w:space="0" w:color="000000"/>
+              <w:left w:val="single" w:sz="48" w:space="0" w:color="FDB602"/>
               <w:bottom w:val="nil" w:sz="4" w:space="0" w:color="000000"/>
               <w:right w:val="nil" w:sz="4" w:space="0" w:color="000000"/>
             </w:tcBorders>
           </w:tcPr>
           <w:p>
             <w:pPr>
-              <w:spacing w:before="80" w:after="0" w:line="276" w:lineRule="auto"/>
+              <w:spacing w:before="0" w:after="0" w:line="276" w:lineRule="auto"/>
             </w:pPr>
             <w:r>
               <w:rPr>
-                <w:rFonts w:ascii="Helvetica" w:hAnsi="Helvetica"/>
+                <w:rFonts w:ascii="Barlow Condensed" w:hAnsi="Barlow Condensed" w:cs="Barlow Condensed"/>
                 <w:b/>
-                <w:color w:val="1B2738"/>
-                <w:sz w:val="16"/>
-                <w:spacing w:val="40"/>
+                <w:i w:val="0"/>
+                <w:color w:val="FDF6E4"/>
+                <w:sz w:val="32"/>
               </w:rPr>
-              <w:t>INDUSTRIES</w:t>
+              <w:t>ONE ROOF.</w:t>
+            </w:r>
+          </w:p>
+          <w:p>
+            <w:pPr>
+              <w:spacing w:before="0" w:after="40" w:line="276" w:lineRule="auto"/>
+            </w:pPr>
+            <w:r>
+              <w:rPr>
+                <w:rFonts w:ascii="Barlow Condensed" w:hAnsi="Barlow Condensed" w:cs="Barlow Condensed"/>
+                <w:b/>
+                <w:i w:val="0"/>
+                <w:color w:val="FDF6E4"/>
+                <w:sz w:val="32"/>
+              </w:rPr>
+              <w:t>END TO END.</w:t>
             </w:r>
           </w:p>
           <w:p>
@@ -1068,158 +1114,26 @@
             </w:pPr>
             <w:r>
               <w:rPr>
-                <w:rFonts w:ascii="Helvetica" w:hAnsi="Helvetica"/>
+                <w:rFonts w:ascii="Figtree" w:hAnsi="Figtree" w:cs="Figtree"/>
                 <w:b w:val="0"/>
-                <w:color w:val="1B2738"/>
-                <w:sz w:val="18"/>
+                <w:i/>
+                <w:color w:val="C9B789"/>
+                <w:sz w:val="16"/>
               </w:rPr>
-              <w:t>Automotive · Mobility · Industrial OEM · Consumer hardware · Architectural · Defense</w:t>
+              <w:t>Receiving · inventory · outbound.</w:t>
             </w:r>
           </w:p>
         </w:tc>
         <w:tc>
           <w:tcPr>
-            <w:tcW w:type="dxa" w:w="3499"/>
-            <w:tcBorders>
-              <w:top w:val="single" w:sz="16" w:space="0" w:color="1B2738"/>
-              <w:left w:val="nil" w:sz="4" w:space="0" w:color="000000"/>
-              <w:bottom w:val="nil" w:sz="4" w:space="0" w:color="000000"/>
-              <w:right w:val="nil" w:sz="4" w:space="0" w:color="000000"/>
-            </w:tcBorders>
-          </w:tcPr>
-          <w:p>
-            <w:pPr>
-              <w:spacing w:before="80" w:after="0" w:line="276" w:lineRule="auto"/>
-            </w:pPr>
-            <w:r>
-              <w:rPr>
-                <w:rFonts w:ascii="Helvetica" w:hAnsi="Helvetica"/>
-                <w:b/>
-                <w:color w:val="1B2738"/>
-                <w:sz w:val="16"/>
-                <w:spacing w:val="40"/>
-              </w:rPr>
-              <w:t>CERTIFICATIONS</w:t>
-            </w:r>
-          </w:p>
-          <w:p>
-            <w:pPr>
-              <w:spacing w:before="0" w:after="0" w:line="276" w:lineRule="auto"/>
-            </w:pPr>
-            <w:r>
-              <w:rPr>
-                <w:rFonts w:ascii="Helvetica" w:hAnsi="Helvetica"/>
-                <w:b w:val="0"/>
-                <w:color w:val="1B2738"/>
-                <w:sz w:val="18"/>
-              </w:rPr>
-              <w:t>ISO 9001:2015 · AWS D1.1 welders · ITAR registered · Detroit-based small business</w:t>
-            </w:r>
-          </w:p>
-        </w:tc>
-        <w:tc>
-          <w:tcPr>
-            <w:tcW w:type="dxa" w:w="3499"/>
-            <w:tcBorders>
-              <w:top w:val="single" w:sz="16" w:space="0" w:color="1B2738"/>
-              <w:left w:val="nil" w:sz="4" w:space="0" w:color="000000"/>
-              <w:bottom w:val="nil" w:sz="4" w:space="0" w:color="000000"/>
-              <w:right w:val="nil" w:sz="4" w:space="0" w:color="000000"/>
-            </w:tcBorders>
-          </w:tcPr>
-          <w:p>
-            <w:pPr>
-              <w:spacing w:before="80" w:after="0" w:line="276" w:lineRule="auto"/>
-            </w:pPr>
-            <w:r>
-              <w:rPr>
-                <w:rFonts w:ascii="Helvetica" w:hAnsi="Helvetica"/>
-                <w:b/>
-                <w:color w:val="1B2738"/>
-                <w:sz w:val="16"/>
-                <w:spacing w:val="40"/>
-              </w:rPr>
-              <w:t>NAICS</w:t>
-            </w:r>
-          </w:p>
-          <w:p>
-            <w:pPr>
-              <w:spacing w:before="0" w:after="0" w:line="276" w:lineRule="auto"/>
-            </w:pPr>
-            <w:r>
-              <w:rPr>
-                <w:rFonts w:ascii="Helvetica" w:hAnsi="Helvetica"/>
-                <w:b w:val="0"/>
-                <w:color w:val="1B2738"/>
-                <w:sz w:val="18"/>
-              </w:rPr>
-              <w:t>332710 · 332312 · 332999 · 333249 · 488991</w:t>
-            </w:r>
-          </w:p>
-        </w:tc>
-      </w:tr>
-    </w:tbl>
-    <w:p>
-      <w:pPr>
-        <w:spacing w:before="0" w:after="200" w:line="276" w:lineRule="auto"/>
-      </w:pPr>
-    </w:p>
-    <w:tbl>
-      <w:tblPr>
-        <w:tblW w:type="auto" w:w="0"/>
-        <w:tblLayout w:type="fixed"/>
-        <w:tblLook w:firstColumn="1" w:firstRow="1" w:lastColumn="0" w:lastRow="0" w:noHBand="0" w:noVBand="1" w:val="04A0"/>
-      </w:tblPr>
-      <w:tblGrid>
-        <w:gridCol w:w="6480"/>
-        <w:gridCol w:w="4176"/>
-      </w:tblGrid>
-      <w:tr>
-        <w:tc>
-          <w:tcPr>
-            <w:tcW w:type="dxa" w:w="6480"/>
-            <w:shd w:val="clear" w:color="auto" w:fill="1B2738"/>
-            <w:tcBorders>
-              <w:top w:val="nil" w:sz="4" w:space="0" w:color="000000"/>
-              <w:left w:val="single" w:sz="48" w:space="0" w:color="F5B82E"/>
-              <w:bottom w:val="nil" w:sz="4" w:space="0" w:color="000000"/>
-              <w:right w:val="nil" w:sz="4" w:space="0" w:color="000000"/>
-            </w:tcBorders>
-          </w:tcPr>
-          <w:p>
-            <w:pPr>
-              <w:spacing w:before="120" w:after="0" w:line="276" w:lineRule="auto"/>
-            </w:pPr>
-            <w:r>
-              <w:rPr>
-                <w:rFonts w:ascii="Helvetica" w:hAnsi="Helvetica"/>
-                <w:b/>
-                <w:color w:val="F5B82E"/>
-                <w:sz w:val="18"/>
-                <w:spacing w:val="50"/>
-              </w:rPr>
-              <w:t>LET'S BUILD IT</w:t>
-            </w:r>
-          </w:p>
-          <w:p>
-            <w:pPr>
-              <w:spacing w:before="0" w:after="120" w:line="276" w:lineRule="auto"/>
-            </w:pPr>
-            <w:r>
-              <w:rPr>
-                <w:rFonts w:ascii="Helvetica" w:hAnsi="Helvetica"/>
-                <w:b/>
-                <w:color w:val="FCF6E6"/>
-                <w:sz w:val="26"/>
-              </w:rPr>
-              <w:t>Send a print. Get a quote in 48 hours.</w:t>
-            </w:r>
-          </w:p>
-        </w:tc>
-        <w:tc>
-          <w:tcPr>
-            <w:tcW w:type="dxa" w:w="4176"/>
-            <w:shd w:val="clear" w:color="auto" w:fill="1B2738"/>
+            <w:tcW w:type="dxa" w:w="8136"/>
+            <w:shd w:val="clear" w:color="auto" w:fill="022429"/>
+            <w:tcMar>
+              <w:top w:w="140" w:type="dxa"/>
+              <w:left w:w="140" w:type="dxa"/>
+              <w:bottom w:w="140" w:type="dxa"/>
+              <w:right w:w="160" w:type="dxa"/>
+            </w:tcMar>
             <w:tcBorders>
               <w:top w:val="nil" w:sz="4" w:space="0" w:color="000000"/>
               <w:left w:val="nil" w:sz="4" w:space="0" w:color="000000"/>
@@ -1229,40 +1143,511 @@
           </w:tcPr>
           <w:p>
             <w:pPr>
-              <w:spacing w:before="160" w:after="0" w:line="276" w:lineRule="auto"/>
-              <w:jc w:val="right"/>
+              <w:spacing w:before="0" w:after="0" w:line="336" w:lineRule="auto"/>
             </w:pPr>
             <w:r>
               <w:rPr>
-                <w:rFonts w:ascii="Helvetica" w:hAnsi="Helvetica"/>
-                <w:b/>
-                <w:color w:val="F5B82E"/>
-                <w:sz w:val="22"/>
+                <w:rFonts w:ascii="Figtree" w:hAnsi="Figtree" w:cs="Figtree"/>
+                <w:b w:val="0"/>
+                <w:i w:val="0"/>
+                <w:color w:val="FDF6E4"/>
+                <w:sz w:val="19"/>
               </w:rPr>
-              <w:t>quotes@beaconmfg.com</w:t>
+              <w:t>Receiving, inventory, and part management with flexible storage on the floor. Parcel and freight outbound — including no-box, roll-on / roll-off for awkward builds. We keep your supply tight so the line never starves.</w:t>
             </w:r>
           </w:p>
           <w:p>
             <w:pPr>
-              <w:spacing w:before="0" w:after="120" w:line="276" w:lineRule="auto"/>
-              <w:jc w:val="right"/>
+              <w:spacing w:before="100" w:after="0" w:line="276" w:lineRule="auto"/>
             </w:pPr>
             <w:r>
               <w:rPr>
-                <w:rFonts w:ascii="Helvetica" w:hAnsi="Helvetica"/>
+                <w:rFonts w:ascii="Figtree" w:hAnsi="Figtree" w:cs="Figtree"/>
+                <w:b/>
+                <w:i w:val="0"/>
+                <w:color w:val="022429"/>
+                <w:sz w:val="16"/>
+                <w:spacing w:val="20"/>
+                <w:shd w:val="clear" w:color="auto" w:fill="FDB602"/>
+              </w:rPr>
+              <w:t xml:space="preserve">  RECEIVING  </w:t>
+            </w:r>
+            <w:r>
+              <w:rPr>
+                <w:rFonts w:ascii="Figtree" w:hAnsi="Figtree" w:cs="Figtree"/>
                 <w:b w:val="0"/>
-                <w:color w:val="FCF6E6"/>
-                <w:sz w:val="20"/>
+                <w:i w:val="0"/>
+                <w:color w:val="022429"/>
+                <w:sz w:val="16"/>
               </w:rPr>
-              <w:t>(313) 555-0184 · beaconmfg.com</w:t>
+              <w:t xml:space="preserve">  </w:t>
+            </w:r>
+            <w:r>
+              <w:rPr>
+                <w:rFonts w:ascii="Figtree" w:hAnsi="Figtree" w:cs="Figtree"/>
+                <w:b/>
+                <w:i w:val="0"/>
+                <w:color w:val="022429"/>
+                <w:sz w:val="16"/>
+                <w:spacing w:val="20"/>
+                <w:shd w:val="clear" w:color="auto" w:fill="FDB602"/>
+              </w:rPr>
+              <w:t xml:space="preserve">  INVENTORY  </w:t>
+            </w:r>
+            <w:r>
+              <w:rPr>
+                <w:rFonts w:ascii="Figtree" w:hAnsi="Figtree" w:cs="Figtree"/>
+                <w:b w:val="0"/>
+                <w:i w:val="0"/>
+                <w:color w:val="022429"/>
+                <w:sz w:val="16"/>
+              </w:rPr>
+              <w:t xml:space="preserve">  </w:t>
+            </w:r>
+            <w:r>
+              <w:rPr>
+                <w:rFonts w:ascii="Figtree" w:hAnsi="Figtree" w:cs="Figtree"/>
+                <w:b/>
+                <w:i w:val="0"/>
+                <w:color w:val="022429"/>
+                <w:sz w:val="16"/>
+                <w:spacing w:val="20"/>
+                <w:shd w:val="clear" w:color="auto" w:fill="FDB602"/>
+              </w:rPr>
+              <w:t xml:space="preserve">  PART MGMT  </w:t>
+            </w:r>
+            <w:r>
+              <w:rPr>
+                <w:rFonts w:ascii="Figtree" w:hAnsi="Figtree" w:cs="Figtree"/>
+                <w:b w:val="0"/>
+                <w:i w:val="0"/>
+                <w:color w:val="022429"/>
+                <w:sz w:val="16"/>
+              </w:rPr>
+              <w:t xml:space="preserve">  </w:t>
+            </w:r>
+            <w:r>
+              <w:rPr>
+                <w:rFonts w:ascii="Figtree" w:hAnsi="Figtree" w:cs="Figtree"/>
+                <w:b/>
+                <w:i w:val="0"/>
+                <w:color w:val="022429"/>
+                <w:sz w:val="16"/>
+                <w:spacing w:val="20"/>
+                <w:shd w:val="clear" w:color="auto" w:fill="FDB602"/>
+              </w:rPr>
+              <w:t xml:space="preserve">  FLEXIBLE STORAGE  </w:t>
+            </w:r>
+            <w:r>
+              <w:rPr>
+                <w:rFonts w:ascii="Figtree" w:hAnsi="Figtree" w:cs="Figtree"/>
+                <w:b w:val="0"/>
+                <w:i w:val="0"/>
+                <w:color w:val="022429"/>
+                <w:sz w:val="16"/>
+              </w:rPr>
+              <w:t xml:space="preserve">  </w:t>
+            </w:r>
+            <w:r>
+              <w:rPr>
+                <w:rFonts w:ascii="Figtree" w:hAnsi="Figtree" w:cs="Figtree"/>
+                <w:b/>
+                <w:i w:val="0"/>
+                <w:color w:val="FDB602"/>
+                <w:sz w:val="16"/>
+                <w:spacing w:val="20"/>
+              </w:rPr>
+              <w:t>[ PARCEL ]</w:t>
+            </w:r>
+            <w:r>
+              <w:rPr>
+                <w:rFonts w:ascii="Figtree" w:hAnsi="Figtree" w:cs="Figtree"/>
+                <w:b w:val="0"/>
+                <w:i w:val="0"/>
+                <w:color w:val="022429"/>
+                <w:sz w:val="16"/>
+              </w:rPr>
+              <w:t xml:space="preserve">  </w:t>
+            </w:r>
+            <w:r>
+              <w:rPr>
+                <w:rFonts w:ascii="Figtree" w:hAnsi="Figtree" w:cs="Figtree"/>
+                <w:b/>
+                <w:i w:val="0"/>
+                <w:color w:val="FDB602"/>
+                <w:sz w:val="16"/>
+                <w:spacing w:val="20"/>
+              </w:rPr>
+              <w:t>[ FREIGHT ]</w:t>
+            </w:r>
+            <w:r>
+              <w:rPr>
+                <w:rFonts w:ascii="Figtree" w:hAnsi="Figtree" w:cs="Figtree"/>
+                <w:b w:val="0"/>
+                <w:i w:val="0"/>
+                <w:color w:val="022429"/>
+                <w:sz w:val="16"/>
+              </w:rPr>
+              <w:t xml:space="preserve">  </w:t>
+            </w:r>
+            <w:r>
+              <w:rPr>
+                <w:rFonts w:ascii="Figtree" w:hAnsi="Figtree" w:cs="Figtree"/>
+                <w:b/>
+                <w:i w:val="0"/>
+                <w:color w:val="FDB602"/>
+                <w:sz w:val="16"/>
+                <w:spacing w:val="20"/>
+              </w:rPr>
+              <w:t>[ ROLL-ON / ROLL-OFF ]</w:t>
             </w:r>
           </w:p>
         </w:tc>
       </w:tr>
     </w:tbl>
+    <w:p>
+      <w:pPr>
+        <w:spacing w:before="0" w:after="40" w:line="276" w:lineRule="auto"/>
+      </w:pPr>
+    </w:p>
+    <w:tbl>
+      <w:tblPr>
+        <w:tblW w:type="auto" w:w="0"/>
+        <w:tblLayout w:type="fixed"/>
+        <w:tblLook w:firstColumn="1" w:firstRow="1" w:lastColumn="0" w:lastRow="0" w:noHBand="0" w:noVBand="1" w:val="04A0"/>
+        <w:tblBorders>
+          <w:top w:val="nil"/>
+          <w:left w:val="nil"/>
+          <w:bottom w:val="nil"/>
+          <w:right w:val="nil"/>
+          <w:insideH w:val="nil"/>
+          <w:insideV w:val="nil"/>
+        </w:tblBorders>
+      </w:tblPr>
+      <w:tblGrid>
+        <w:gridCol w:w="3542"/>
+        <w:gridCol w:w="3542"/>
+        <w:gridCol w:w="3542"/>
+      </w:tblGrid>
+      <w:tr>
+        <w:tc>
+          <w:tcPr>
+            <w:tcW w:type="dxa" w:w="3542"/>
+            <w:tcBorders>
+              <w:top w:val="single" w:sz="18" w:space="0" w:color="022429"/>
+              <w:left w:val="nil" w:sz="4" w:space="0" w:color="000000"/>
+              <w:bottom w:val="nil" w:sz="4" w:space="0" w:color="000000"/>
+              <w:right w:val="nil" w:sz="4" w:space="0" w:color="000000"/>
+            </w:tcBorders>
+            <w:tcMar>
+              <w:top w:w="100" w:type="dxa"/>
+              <w:left w:w="40" w:type="dxa"/>
+              <w:bottom w:w="40" w:type="dxa"/>
+              <w:right w:w="80" w:type="dxa"/>
+            </w:tcMar>
+          </w:tcPr>
+          <w:p>
+            <w:pPr>
+              <w:spacing w:before="0" w:after="0" w:line="276" w:lineRule="auto"/>
+            </w:pPr>
+            <w:r>
+              <w:rPr>
+                <w:rFonts w:ascii="Barlow Condensed" w:hAnsi="Barlow Condensed" w:cs="Barlow Condensed"/>
+                <w:b/>
+                <w:i w:val="0"/>
+                <w:color w:val="022429"/>
+                <w:sz w:val="20"/>
+                <w:spacing w:val="50"/>
+              </w:rPr>
+              <w:t>MADE FOR</w:t>
+            </w:r>
+          </w:p>
+          <w:p>
+            <w:pPr>
+              <w:spacing w:before="0" w:after="0" w:line="324" w:lineRule="auto"/>
+            </w:pPr>
+            <w:r>
+              <w:rPr>
+                <w:rFonts w:ascii="Figtree" w:hAnsi="Figtree" w:cs="Figtree"/>
+                <w:b w:val="0"/>
+                <w:i w:val="0"/>
+                <w:color w:val="022429"/>
+                <w:sz w:val="18"/>
+              </w:rPr>
+              <w:t>Hardware founders · Industrial OEMs · Mobility · Architectural · Defense &amp; gov · Consumer goods</w:t>
+            </w:r>
+          </w:p>
+        </w:tc>
+        <w:tc>
+          <w:tcPr>
+            <w:tcW w:type="dxa" w:w="3542"/>
+            <w:tcBorders>
+              <w:top w:val="single" w:sz="18" w:space="0" w:color="022429"/>
+              <w:left w:val="nil" w:sz="4" w:space="0" w:color="000000"/>
+              <w:bottom w:val="nil" w:sz="4" w:space="0" w:color="000000"/>
+              <w:right w:val="nil" w:sz="4" w:space="0" w:color="000000"/>
+            </w:tcBorders>
+            <w:tcMar>
+              <w:top w:w="100" w:type="dxa"/>
+              <w:left w:w="40" w:type="dxa"/>
+              <w:bottom w:w="40" w:type="dxa"/>
+              <w:right w:w="80" w:type="dxa"/>
+            </w:tcMar>
+          </w:tcPr>
+          <w:p>
+            <w:pPr>
+              <w:spacing w:before="0" w:after="0" w:line="276" w:lineRule="auto"/>
+            </w:pPr>
+            <w:r>
+              <w:rPr>
+                <w:rFonts w:ascii="Barlow Condensed" w:hAnsi="Barlow Condensed" w:cs="Barlow Condensed"/>
+                <w:b/>
+                <w:i w:val="0"/>
+                <w:color w:val="022429"/>
+                <w:sz w:val="20"/>
+                <w:spacing w:val="50"/>
+              </w:rPr>
+              <w:t>HOW WE WORK</w:t>
+            </w:r>
+          </w:p>
+          <w:p>
+            <w:pPr>
+              <w:spacing w:before="0" w:after="0" w:line="324" w:lineRule="auto"/>
+            </w:pPr>
+            <w:r>
+              <w:rPr>
+                <w:rFonts w:ascii="Figtree" w:hAnsi="Figtree" w:cs="Figtree"/>
+                <w:b w:val="0"/>
+                <w:i w:val="0"/>
+                <w:color w:val="022429"/>
+                <w:sz w:val="18"/>
+              </w:rPr>
+              <w:t>Send a print, a CAD file, or a napkin sketch. We quote, prototype, and put it on a line.</w:t>
+            </w:r>
+          </w:p>
+        </w:tc>
+        <w:tc>
+          <w:tcPr>
+            <w:tcW w:type="dxa" w:w="3542"/>
+            <w:tcBorders>
+              <w:top w:val="single" w:sz="18" w:space="0" w:color="022429"/>
+              <w:left w:val="nil" w:sz="4" w:space="0" w:color="000000"/>
+              <w:bottom w:val="nil" w:sz="4" w:space="0" w:color="000000"/>
+              <w:right w:val="nil" w:sz="4" w:space="0" w:color="000000"/>
+            </w:tcBorders>
+            <w:tcMar>
+              <w:top w:w="100" w:type="dxa"/>
+              <w:left w:w="40" w:type="dxa"/>
+              <w:bottom w:w="40" w:type="dxa"/>
+              <w:right w:w="80" w:type="dxa"/>
+            </w:tcMar>
+          </w:tcPr>
+          <w:p>
+            <w:pPr>
+              <w:spacing w:before="0" w:after="0" w:line="276" w:lineRule="auto"/>
+            </w:pPr>
+            <w:r>
+              <w:rPr>
+                <w:rFonts w:ascii="Barlow Condensed" w:hAnsi="Barlow Condensed" w:cs="Barlow Condensed"/>
+                <w:b/>
+                <w:i w:val="0"/>
+                <w:color w:val="022429"/>
+                <w:sz w:val="20"/>
+                <w:spacing w:val="50"/>
+              </w:rPr>
+              <w:t>ETHOS</w:t>
+            </w:r>
+          </w:p>
+          <w:p>
+            <w:pPr>
+              <w:spacing w:before="0" w:after="0" w:line="324" w:lineRule="auto"/>
+            </w:pPr>
+            <w:r>
+              <w:rPr>
+                <w:rFonts w:ascii="Figtree" w:hAnsi="Figtree" w:cs="Figtree"/>
+                <w:b w:val="0"/>
+                <w:i w:val="0"/>
+                <w:color w:val="022429"/>
+                <w:sz w:val="18"/>
+              </w:rPr>
+              <w:t>Local Mfg. · 100% Onshore American Industry · Builder-led · Detroit</w:t>
+            </w:r>
+          </w:p>
+        </w:tc>
+      </w:tr>
+    </w:tbl>
+    <w:p>
+      <w:pPr>
+        <w:spacing w:before="0" w:after="120" w:line="276" w:lineRule="auto"/>
+      </w:pPr>
+    </w:p>
+    <w:p>
+      <w:pPr>
+        <w:spacing w:before="0" w:after="120" w:line="276" w:lineRule="auto"/>
+      </w:pPr>
+    </w:p>
+    <w:tbl>
+      <w:tblPr>
+        <w:tblW w:type="auto" w:w="0"/>
+        <w:tblLayout w:type="fixed"/>
+        <w:tblLook w:firstColumn="1" w:firstRow="1" w:lastColumn="0" w:lastRow="0" w:noHBand="0" w:noVBand="1" w:val="04A0"/>
+        <w:tblBorders>
+          <w:top w:val="nil"/>
+          <w:left w:val="nil"/>
+          <w:bottom w:val="nil"/>
+          <w:right w:val="nil"/>
+          <w:insideH w:val="nil"/>
+          <w:insideV w:val="nil"/>
+        </w:tblBorders>
+      </w:tblPr>
+      <w:tblGrid>
+        <w:gridCol w:w="6624"/>
+        <w:gridCol w:w="4176"/>
+      </w:tblGrid>
+      <w:tr>
+        <w:tc>
+          <w:tcPr>
+            <w:tcW w:type="dxa" w:w="6624"/>
+            <w:shd w:val="clear" w:color="auto" w:fill="FDB602"/>
+            <w:tcMar>
+              <w:top w:w="180" w:type="dxa"/>
+              <w:left w:w="220" w:type="dxa"/>
+              <w:bottom w:w="180" w:type="dxa"/>
+              <w:right w:w="140" w:type="dxa"/>
+            </w:tcMar>
+            <w:tcBorders>
+              <w:top w:val="nil" w:sz="4" w:space="0" w:color="000000"/>
+              <w:left w:val="single" w:sz="64" w:space="0" w:color="022429"/>
+              <w:bottom w:val="nil" w:sz="4" w:space="0" w:color="000000"/>
+              <w:right w:val="nil" w:sz="4" w:space="0" w:color="000000"/>
+            </w:tcBorders>
+          </w:tcPr>
+          <w:p>
+            <w:pPr>
+              <w:spacing w:before="0" w:after="0" w:line="276" w:lineRule="auto"/>
+            </w:pPr>
+            <w:r>
+              <w:rPr>
+                <w:rFonts w:ascii="Barlow Condensed" w:hAnsi="Barlow Condensed" w:cs="Barlow Condensed"/>
+                <w:b/>
+                <w:i w:val="0"/>
+                <w:color w:val="022429"/>
+                <w:sz w:val="20"/>
+                <w:spacing w:val="50"/>
+              </w:rPr>
+              <w:t>HAVE A PART, KIT, OR ASSEMBLY IN MIND?</w:t>
+            </w:r>
+          </w:p>
+          <w:p>
+            <w:pPr>
+              <w:spacing w:before="40" w:after="0" w:line="276" w:lineRule="auto"/>
+            </w:pPr>
+            <w:r>
+              <w:rPr>
+                <w:rFonts w:ascii="Barlow Condensed" w:hAnsi="Barlow Condensed" w:cs="Barlow Condensed"/>
+                <w:b/>
+                <w:i w:val="0"/>
+                <w:color w:val="022429"/>
+                <w:sz w:val="40"/>
+              </w:rPr>
+              <w:t>SEND A PRINT. WE'LL PUT IT ON A LINE.</w:t>
+            </w:r>
+          </w:p>
+        </w:tc>
+        <w:tc>
+          <w:tcPr>
+            <w:tcW w:type="dxa" w:w="4176"/>
+            <w:shd w:val="clear" w:color="auto" w:fill="FDB602"/>
+            <w:tcMar>
+              <w:top w:w="180" w:type="dxa"/>
+              <w:left w:w="140" w:type="dxa"/>
+              <w:bottom w:w="180" w:type="dxa"/>
+              <w:right w:w="200" w:type="dxa"/>
+            </w:tcMar>
+            <w:tcBorders>
+              <w:top w:val="nil" w:sz="4" w:space="0" w:color="000000"/>
+              <w:left w:val="nil" w:sz="4" w:space="0" w:color="000000"/>
+              <w:bottom w:val="nil" w:sz="4" w:space="0" w:color="000000"/>
+              <w:right w:val="nil" w:sz="4" w:space="0" w:color="000000"/>
+            </w:tcBorders>
+          </w:tcPr>
+          <w:p>
+            <w:pPr>
+              <w:spacing w:before="80" w:after="0" w:line="276" w:lineRule="auto"/>
+              <w:jc w:val="right"/>
+            </w:pPr>
+            <w:r>
+              <w:rPr>
+                <w:rFonts w:ascii="Barlow Condensed" w:hAnsi="Barlow Condensed" w:cs="Barlow Condensed"/>
+                <w:b/>
+                <w:i w:val="0"/>
+                <w:color w:val="022429"/>
+                <w:sz w:val="28"/>
+                <w:spacing w:val="50"/>
+              </w:rPr>
+              <w:t>BEACONMFG.US</w:t>
+            </w:r>
+          </w:p>
+          <w:p>
+            <w:pPr>
+              <w:spacing w:before="20" w:after="0" w:line="276" w:lineRule="auto"/>
+              <w:jc w:val="right"/>
+            </w:pPr>
+            <w:r>
+              <w:rPr>
+                <w:rFonts w:ascii="Figtree" w:hAnsi="Figtree" w:cs="Figtree"/>
+                <w:b w:val="0"/>
+                <w:i w:val="0"/>
+                <w:color w:val="022429"/>
+                <w:sz w:val="18"/>
+              </w:rPr>
+              <w:t>2050 15th St · Detroit, MI 48216</w:t>
+            </w:r>
+          </w:p>
+        </w:tc>
+      </w:tr>
+    </w:tbl>
+    <w:p>
+      <w:pPr>
+        <w:spacing w:before="80" w:after="0" w:line="276" w:lineRule="auto"/>
+      </w:pPr>
+      <w:r>
+        <w:rPr>
+          <w:rFonts w:ascii="Figtree" w:hAnsi="Figtree" w:cs="Figtree"/>
+          <w:b/>
+          <w:i w:val="0"/>
+          <w:color w:val="022429"/>
+          <w:sz w:val="15"/>
+          <w:spacing w:val="30"/>
+        </w:rPr>
+        <w:t xml:space="preserve">BEACON © 2026     </w:t>
+      </w:r>
+      <w:r>
+        <w:rPr>
+          <w:rFonts w:ascii="Figtree" w:hAnsi="Figtree" w:cs="Figtree"/>
+          <w:b/>
+          <w:i w:val="0"/>
+          <w:color w:val="022429"/>
+          <w:sz w:val="15"/>
+          <w:spacing w:val="30"/>
+        </w:rPr>
+        <w:t xml:space="preserve">·     LOCAL MFG. · 100% ONSHORE AMERICAN INDUSTRY     </w:t>
+      </w:r>
+      <w:r>
+        <w:rPr>
+          <w:rFonts w:ascii="Figtree" w:hAnsi="Figtree" w:cs="Figtree"/>
+          <w:b/>
+          <w:i w:val="0"/>
+          <w:color w:val="022429"/>
+          <w:sz w:val="15"/>
+          <w:spacing w:val="30"/>
+        </w:rPr>
+        <w:t>·     CAPABILITIES STATEMENT · V2</w:t>
+      </w:r>
+    </w:p>
     <w:sectPr>
       <w:pgSz w:w="12240" w:h="15840"/>
-      <w:pgMar w:top="720" w:right="792" w:bottom="720" w:left="792" w:header="720" w:footer="720" w:gutter="0"/>
+      <w:pgMar w:top="648" w:right="720" w:bottom="576" w:left="720" w:header="720" w:footer="720" w:gutter="0"/>
       <w:cols w:space="720"/>
       <w:docGrid w:linePitch="360"/>
     </w:sectPr>
@@ -1634,8 +2019,8 @@
     <w:qFormat/>
     <w:rsid w:val="00FC693F"/>
     <w:rPr>
-      <w:rFonts w:ascii="Helvetica" w:hAnsi="Helvetica"/>
-      <w:color w:val="1B2738"/>
+      <w:rFonts w:ascii="Figtree" w:hAnsi="Figtree"/>
+      <w:color w:val="022429"/>
       <w:sz w:val="20"/>
     </w:rPr>
   </w:style>

</xml_diff>

<commit_message>
Fix map letterboxing: widen map column (flex 2.4) for better visual weight
User feedback: map still felt squished even with the wider crop because the
column was being forced taller by the sidebar content, creating cream
letterbox space above/below the map content within its column.

Root cause: map content at 2.61:1 aspect rendering in a ~1.49:1 column
(sidebar was taller than map's natural height at that width).

Fix: change the map column flex from 1.65 to 2.4, making the map column
~71% of the row width instead of ~62%. At the wider column, the map's
natural rendered height (2.61:1 aspect) is closer to the sidebar's content
height, eliminating most letterboxing. The map content now fills the
column with proper visual weight.

DOCX mirrors the new proportions: map cell 5.25in, sidebar cell 2.05in.

Co-Authored-By: Claude Opus 4.7 (1M context) <noreply@anthropic.com>
</commit_message>
<xml_diff>
--- a/Beacon-Capabilities-Statement.docx
+++ b/Beacon-Capabilities-Statement.docx
@@ -1070,13 +1070,13 @@
               </w:tblBorders>
             </w:tblPr>
             <w:tblGrid>
-              <w:gridCol w:w="6552"/>
-              <w:gridCol w:w="3960"/>
+              <w:gridCol w:w="7560"/>
+              <w:gridCol w:w="2952"/>
             </w:tblGrid>
             <w:tr>
               <w:tc>
                 <w:tcPr>
-                  <w:tcW w:type="dxa" w:w="6552"/>
+                  <w:tcW w:type="dxa" w:w="7560"/>
                   <w:tcMar>
                     <w:top w:w="0" w:type="dxa"/>
                     <w:left w:w="0" w:type="dxa"/>
@@ -1092,7 +1092,7 @@
                   <w:r>
                     <w:drawing>
                       <wp:inline xmlns:a="http://schemas.openxmlformats.org/drawingml/2006/main" xmlns:pic="http://schemas.openxmlformats.org/drawingml/2006/picture">
-                        <wp:extent cx="4023360" cy="1541450"/>
+                        <wp:extent cx="4663440" cy="1786680"/>
                         <wp:docPr id="3" name="Picture 3"/>
                         <wp:cNvGraphicFramePr>
                           <a:graphicFrameLocks noChangeAspect="1"/>
@@ -1113,7 +1113,7 @@
                               <pic:spPr>
                                 <a:xfrm>
                                   <a:off x="0" y="0"/>
-                                  <a:ext cx="4023360" cy="1541450"/>
+                                  <a:ext cx="4663440" cy="1786680"/>
                                 </a:xfrm>
                                 <a:prstGeom prst="rect"/>
                               </pic:spPr>
@@ -1127,7 +1127,7 @@
               </w:tc>
               <w:tc>
                 <w:tcPr>
-                  <w:tcW w:type="dxa" w:w="3960"/>
+                  <w:tcW w:type="dxa" w:w="2952"/>
                   <w:shd w:val="clear" w:color="auto" w:fill="022429"/>
                   <w:tcMar>
                     <w:top w:w="200" w:type="dxa"/>

</xml_diff>